<commit_message>
Keep drafted sections consistent with policy results: pass the policy checks to analysis sections, no new calculations, no padding
</commit_message>
<xml_diff>
--- a/samples/patel-agro-complex.docx
+++ b/samples/patel-agro-complex.docx
@@ -23,28 +23,46 @@
         <w:tblStyle w:val="LightGrid-Accent1"/>
         <w:tblW w:type="auto" w:w="0"/>
         <w:tblLook w:firstColumn="1" w:firstRow="1" w:lastColumn="0" w:lastRow="0" w:noHBand="0" w:noVBand="1" w:val="04A0"/>
+        <w:tblBorders>
+          <w:top w:val="single" w:sz="4" w:color="C9D3DF"/>
+          <w:left w:val="single" w:sz="4" w:color="C9D3DF"/>
+          <w:bottom w:val="single" w:sz="4" w:color="C9D3DF"/>
+          <w:right w:val="single" w:sz="4" w:color="C9D3DF"/>
+          <w:insideH w:val="single" w:sz="4" w:color="C9D3DF"/>
+          <w:insideV w:val="single" w:sz="4" w:color="C9D3DF"/>
+        </w:tblBorders>
       </w:tblPr>
       <w:tblGrid>
-        <w:gridCol w:w="4320"/>
-        <w:gridCol w:w="4320"/>
+        <w:gridCol w:w="4873"/>
+        <w:gridCol w:w="4873"/>
       </w:tblGrid>
       <w:tr>
         <w:tc>
           <w:tcPr>
-            <w:tcW w:type="dxa" w:w="4320"/>
+            <w:tcW w:type="dxa" w:w="2835"/>
+            <w:shd w:val="clear" w:fill="1F3A5F"/>
           </w:tcPr>
           <w:p>
             <w:r>
+              <w:rPr>
+                <w:b/>
+                <w:color w:val="FFFFFF"/>
+              </w:rPr>
               <w:t>Field</w:t>
             </w:r>
           </w:p>
         </w:tc>
         <w:tc>
           <w:tcPr>
-            <w:tcW w:type="dxa" w:w="4320"/>
+            <w:tcW w:type="dxa" w:w="6236"/>
+            <w:shd w:val="clear" w:fill="1F3A5F"/>
           </w:tcPr>
           <w:p>
             <w:r>
+              <w:rPr>
+                <w:b/>
+                <w:color w:val="FFFFFF"/>
+              </w:rPr>
               <w:t>Detail</w:t>
             </w:r>
           </w:p>
@@ -53,21 +71,24 @@
       <w:tr>
         <w:tc>
           <w:tcPr>
-            <w:tcW w:type="dxa" w:w="4320"/>
+            <w:tcW w:type="dxa" w:w="2835"/>
           </w:tcPr>
           <w:p>
             <w:r>
+              <w:rPr>
+                <w:b/>
+              </w:rPr>
               <w:t>Facility</w:t>
             </w:r>
           </w:p>
         </w:tc>
         <w:tc>
           <w:tcPr>
-            <w:tcW w:type="dxa" w:w="4320"/>
+            <w:tcW w:type="dxa" w:w="6236"/>
           </w:tcPr>
           <w:p>
             <w:r>
-              <w:t>₹5.0 Cr term loan</w:t>
+              <w:t>₹5 Cr term loan</w:t>
             </w:r>
           </w:p>
         </w:tc>
@@ -75,17 +96,45 @@
       <w:tr>
         <w:tc>
           <w:tcPr>
-            <w:tcW w:type="dxa" w:w="4320"/>
+            <w:tcW w:type="dxa" w:w="2835"/>
           </w:tcPr>
           <w:p>
             <w:r>
+              <w:rPr>
+                <w:b/>
+              </w:rPr>
+              <w:t>Industry / location</w:t>
+            </w:r>
+          </w:p>
+        </w:tc>
+        <w:tc>
+          <w:tcPr>
+            <w:tcW w:type="dxa" w:w="6236"/>
+          </w:tcPr>
+          <w:p>
+            <w:r>
+              <w:t>Food processing (spices and pulses), Nashik</w:t>
+            </w:r>
+          </w:p>
+        </w:tc>
+      </w:tr>
+      <w:tr>
+        <w:tc>
+          <w:tcPr>
+            <w:tcW w:type="dxa" w:w="2835"/>
+          </w:tcPr>
+          <w:p>
+            <w:r>
+              <w:rPr>
+                <w:b/>
+              </w:rPr>
               <w:t>Date</w:t>
             </w:r>
           </w:p>
         </w:tc>
         <w:tc>
           <w:tcPr>
-            <w:tcW w:type="dxa" w:w="4320"/>
+            <w:tcW w:type="dxa" w:w="6236"/>
           </w:tcPr>
           <w:p>
             <w:r>
@@ -97,17 +146,20 @@
       <w:tr>
         <w:tc>
           <w:tcPr>
-            <w:tcW w:type="dxa" w:w="4320"/>
+            <w:tcW w:type="dxa" w:w="2835"/>
           </w:tcPr>
           <w:p>
             <w:r>
+              <w:rPr>
+                <w:b/>
+              </w:rPr>
               <w:t>Data basis</w:t>
             </w:r>
           </w:p>
         </w:tc>
         <w:tc>
           <w:tcPr>
-            <w:tcW w:type="dxa" w:w="4320"/>
+            <w:tcW w:type="dxa" w:w="6236"/>
           </w:tcPr>
           <w:p>
             <w:r>
@@ -119,17 +171,20 @@
       <w:tr>
         <w:tc>
           <w:tcPr>
-            <w:tcW w:type="dxa" w:w="4320"/>
+            <w:tcW w:type="dxa" w:w="2835"/>
           </w:tcPr>
           <w:p>
             <w:r>
+              <w:rPr>
+                <w:b/>
+              </w:rPr>
               <w:t>Prepared by</w:t>
             </w:r>
           </w:p>
         </w:tc>
         <w:tc>
           <w:tcPr>
-            <w:tcW w:type="dxa" w:w="4320"/>
+            <w:tcW w:type="dxa" w:w="6236"/>
           </w:tcPr>
           <w:p>
             <w:r>
@@ -141,17 +196,20 @@
       <w:tr>
         <w:tc>
           <w:tcPr>
-            <w:tcW w:type="dxa" w:w="4320"/>
+            <w:tcW w:type="dxa" w:w="2835"/>
           </w:tcPr>
           <w:p>
             <w:r>
+              <w:rPr>
+                <w:b/>
+              </w:rPr>
               <w:t>Status</w:t>
             </w:r>
           </w:p>
         </w:tc>
         <w:tc>
           <w:tcPr>
-            <w:tcW w:type="dxa" w:w="4320"/>
+            <w:tcW w:type="dxa" w:w="6236"/>
           </w:tcPr>
           <w:p>
             <w:r>
@@ -162,16 +220,51 @@
       </w:tr>
     </w:tbl>
     <w:p/>
-    <w:p>
-      <w:r>
-        <w:rPr>
-          <w:b/>
-          <w:color w:val="B01E1E"/>
-          <w:sz w:val="26"/>
-        </w:rPr>
-        <w:t>Recommendation: REFER TO COMMITTEE WITH CONDITIONS</w:t>
-      </w:r>
-    </w:p>
+    <w:tbl>
+      <w:tblPr>
+        <w:tblW w:type="auto" w:w="0"/>
+        <w:tblLook w:firstColumn="1" w:firstRow="1" w:lastColumn="0" w:lastRow="0" w:noHBand="0" w:noVBand="1" w:val="04A0"/>
+      </w:tblPr>
+      <w:tblGrid>
+        <w:gridCol w:w="9746"/>
+      </w:tblGrid>
+      <w:tr>
+        <w:tc>
+          <w:tcPr>
+            <w:tcW w:type="dxa" w:w="9746"/>
+            <w:shd w:val="clear" w:fill="FDECEA"/>
+          </w:tcPr>
+          <w:p>
+            <w:r>
+              <w:rPr>
+                <w:b/>
+                <w:color w:val="666666"/>
+                <w:sz w:val="16"/>
+              </w:rPr>
+              <w:t>RECOMMENDATION</w:t>
+              <w:br/>
+            </w:r>
+            <w:r>
+              <w:rPr>
+                <w:b/>
+                <w:color w:val="B01E1E"/>
+                <w:sz w:val="28"/>
+              </w:rPr>
+              <w:t>REFER TO COMMITTEE WITH CONDITIONS</w:t>
+            </w:r>
+            <w:r>
+              <w:rPr>
+                <w:color w:val="666666"/>
+                <w:sz w:val="18"/>
+              </w:rPr>
+              <w:br/>
+              <w:t>4 of 6 policy rules pass · fails: DSCR, GST vs bank credits gap</w:t>
+            </w:r>
+          </w:p>
+        </w:tc>
+      </w:tr>
+    </w:tbl>
+    <w:p/>
     <w:p>
       <w:pPr>
         <w:pStyle w:val="Heading2"/>
@@ -185,7 +278,13 @@
         <w:pStyle w:val="ListBullet"/>
       </w:pPr>
       <w:r>
-        <w:t>Assumption: Use FY25 provisional financials as audited figures are not yet available.</w:t>
+        <w:rPr>
+          <w:b/>
+        </w:rPr>
+        <w:t xml:space="preserve">Assumption: </w:t>
+      </w:r>
+      <w:r>
+        <w:t>FY25 audited financials are not available; use FY25 provisional figures for analysis.</w:t>
       </w:r>
     </w:p>
     <w:p>
@@ -193,7 +292,13 @@
         <w:pStyle w:val="ListBullet"/>
       </w:pPr>
       <w:r>
-        <w:t>Assumption: Treat the discrepancy between GST turnover and bank statement balances as a data quality issue to be highlighted in the Risk Assessment.</w:t>
+        <w:rPr>
+          <w:b/>
+        </w:rPr>
+        <w:t xml:space="preserve">Assumption: </w:t>
+      </w:r>
+      <w:r>
+        <w:t>GST turnover discrepancy with bank statements will be highlighted in the risk assessment.</w:t>
       </w:r>
     </w:p>
     <w:p>
@@ -201,7 +306,13 @@
         <w:pStyle w:val="ListBullet"/>
       </w:pPr>
       <w:r>
-        <w:t>Flag: FY25 audited financials not available; provisional figures used</w:t>
+        <w:rPr>
+          <w:b/>
+        </w:rPr>
+        <w:t xml:space="preserve">Flag: </w:t>
+      </w:r>
+      <w:r>
+        <w:t>FY25 audited financials not available; provisional figures used</w:t>
       </w:r>
     </w:p>
     <w:p>
@@ -209,7 +320,13 @@
         <w:pStyle w:val="ListBullet"/>
       </w:pPr>
       <w:r>
-        <w:t>Flag: 2 bounced cheques in the last 12 months</w:t>
+        <w:rPr>
+          <w:b/>
+        </w:rPr>
+        <w:t xml:space="preserve">Flag: </w:t>
+      </w:r>
+      <w:r>
+        <w:t>2 bounced cheques in the last 12 months</w:t>
       </w:r>
     </w:p>
     <w:p>
@@ -217,7 +334,13 @@
         <w:pStyle w:val="ListBullet"/>
       </w:pPr>
       <w:r>
-        <w:t>Flag: DSCR 1.08 breaches policy (&gt;= 1.25)</w:t>
+        <w:rPr>
+          <w:b/>
+        </w:rPr>
+        <w:t xml:space="preserve">Flag: </w:t>
+      </w:r>
+      <w:r>
+        <w:t>DSCR 1.08 breaches policy (&gt;= 1.25)</w:t>
       </w:r>
     </w:p>
     <w:p>
@@ -225,7 +348,13 @@
         <w:pStyle w:val="ListBullet"/>
       </w:pPr>
       <w:r>
-        <w:t>Flag: GST vs bank credits gap 18.1% breaches policy (&lt;= 10%)</w:t>
+        <w:rPr>
+          <w:b/>
+        </w:rPr>
+        <w:t xml:space="preserve">Flag: </w:t>
+      </w:r>
+      <w:r>
+        <w:t>GST vs bank credits gap 18.1% breaches policy (&lt;= 10%)</w:t>
       </w:r>
     </w:p>
     <w:p>
@@ -233,7 +362,13 @@
         <w:pStyle w:val="ListBullet"/>
       </w:pPr>
       <w:r>
-        <w:t>Open question: When will FY25 audited financials be submitted?</w:t>
+        <w:rPr>
+          <w:b/>
+        </w:rPr>
+        <w:t xml:space="preserve">Open question: </w:t>
+      </w:r>
+      <w:r>
+        <w:t>When will FY25 audited financials be submitted?</w:t>
       </w:r>
     </w:p>
     <w:p>
@@ -241,7 +376,13 @@
         <w:pStyle w:val="ListBullet"/>
       </w:pPr>
       <w:r>
-        <w:t>Open question: What explains the 18.1% gap between GST turnover and bank credits?</w:t>
+        <w:rPr>
+          <w:b/>
+        </w:rPr>
+        <w:t xml:space="preserve">Open question: </w:t>
+      </w:r>
+      <w:r>
+        <w:t>What explains the 18.1% gap between GST turnover and bank credits?</w:t>
       </w:r>
     </w:p>
     <w:p>
@@ -253,8 +394,37 @@
       </w:r>
     </w:p>
     <w:p>
+      <w:pPr>
+        <w:spacing w:after="120"/>
+      </w:pPr>
       <w:r>
-        <w:t>Patel Agro Pvt Ltd, a food‑processing company specializing in spices and pulses, is headquartered in Nashik. The firm has been operating for nine years and is promoted by Ramesh Patel and Kavita Patel. Its current financing arrangement is with Saraswat Co‑operative Bank. The company is seeking a term loan of ₹5.0 Cr to meet its working‑capital and expansion requirements. No additional financial or operational details are provided.</w:t>
+        <w:rPr>
+          <w:b w:val="0"/>
+        </w:rPr>
+        <w:t>Patel Agro Pvt Ltd is a 9‑year‑old food‑processing company specializing in spices and pulses, headquartered in Nashik. The business is promoted by Ramesh Patel and Kavita Patel.</w:t>
+      </w:r>
+    </w:p>
+    <w:p>
+      <w:pPr>
+        <w:spacing w:after="120"/>
+      </w:pPr>
+      <w:r>
+        <w:rPr>
+          <w:b w:val="0"/>
+        </w:rPr>
+        <w:t xml:space="preserve">The borrower seeks a </w:t>
+      </w:r>
+      <w:r>
+        <w:rPr>
+          <w:b/>
+        </w:rPr>
+        <w:t>₹5.0 Cr term loan</w:t>
+      </w:r>
+      <w:r>
+        <w:rPr>
+          <w:b w:val="0"/>
+        </w:rPr>
+        <w:t xml:space="preserve"> to support its ongoing operations and growth initiatives. Its current banking relationship is with Saraswat Co‑operative Bank.</w:t>
       </w:r>
     </w:p>
     <w:p>
@@ -266,8 +436,118 @@
       </w:r>
     </w:p>
     <w:p>
+      <w:pPr>
+        <w:spacing w:after="120"/>
+      </w:pPr>
       <w:r>
-        <w:t>Revenue rose from ₹14.6 Cr in FY24 (audited) to ₹15.4 Cr in FY25 (provisional), indicating a modest top‑line growth. Correspondingly, profit after tax increased from ₹1.08 Cr to ₹1.2 Cr, while depreciation and interest expense each rose slightly, from ₹0.56 Cr to ₹0.6 Cr and from ₹0.64 Cr to ₹0.68 Cr respectively, reflecting higher asset base and financing costs. The FY25 ratios show a debt service coverage ratio of 1.08, a loan‑to‑value of 58.1 %, a debt‑to‑equity of 1.9, and a current ratio of 1.3, suggesting adequate but limited coverage of debt obligations and modest liquidity. Annual cash accrual is ₹2.48 Cr against annual debt service (including new loan) of ₹2.3 Cr, providing a narrow cash buffer. The GST‑vs‑bank‑credits gap stands at 18.1 %, indicating a notable disparity between tax liabilities and bank financing.</w:t>
+        <w:rPr>
+          <w:b w:val="0"/>
+        </w:rPr>
+        <w:t xml:space="preserve">Revenue increased from </w:t>
+      </w:r>
+      <w:r>
+        <w:rPr>
+          <w:b/>
+        </w:rPr>
+        <w:t>₹14.6 Cr</w:t>
+      </w:r>
+      <w:r>
+        <w:rPr>
+          <w:b w:val="0"/>
+        </w:rPr>
+        <w:t xml:space="preserve"> in FY24 to </w:t>
+      </w:r>
+      <w:r>
+        <w:rPr>
+          <w:b/>
+        </w:rPr>
+        <w:t>₹15.4 Cr</w:t>
+      </w:r>
+      <w:r>
+        <w:rPr>
+          <w:b w:val="0"/>
+        </w:rPr>
+        <w:t xml:space="preserve"> in FY25, reflecting modest growth. PAT rose from </w:t>
+      </w:r>
+      <w:r>
+        <w:rPr>
+          <w:b/>
+        </w:rPr>
+        <w:t>₹1.08 Cr</w:t>
+      </w:r>
+      <w:r>
+        <w:rPr>
+          <w:b w:val="0"/>
+        </w:rPr>
+        <w:t xml:space="preserve"> to </w:t>
+      </w:r>
+      <w:r>
+        <w:rPr>
+          <w:b/>
+        </w:rPr>
+        <w:t>₹1.2 Cr</w:t>
+      </w:r>
+      <w:r>
+        <w:rPr>
+          <w:b w:val="0"/>
+        </w:rPr>
+        <w:t>, while depreciation and interest expenses showed proportional increases (depreciation ₹0.56 Cr → ₹0.6 Cr; interest ₹0.64 Cr → ₹0.68 Cr).</w:t>
+      </w:r>
+    </w:p>
+    <w:p>
+      <w:pPr>
+        <w:spacing w:after="120"/>
+      </w:pPr>
+      <w:r>
+        <w:rPr>
+          <w:b w:val="0"/>
+        </w:rPr>
+        <w:t xml:space="preserve">Key ratios for FY25 are: DSCR 1.08 (below the required ≥ 1.25), loan‑to‑value 58.1% (within the ≤ 70% limit), debt‑to‑equity 1.9 (under the ≤ 2.0 ceiling), current ratio 1.3 (above the ≥ 1.2 threshold), and GST‑vs‑bank‑credits gap 18.1% (exceeds the ≤ 10% limit). The proposed loan amount of </w:t>
+      </w:r>
+      <w:r>
+        <w:rPr>
+          <w:b/>
+        </w:rPr>
+        <w:t>₹5.0 Cr</w:t>
+      </w:r>
+      <w:r>
+        <w:rPr>
+          <w:b w:val="0"/>
+        </w:rPr>
+        <w:t xml:space="preserve"> complies with the ≤ ₹10 Cr policy.</w:t>
+      </w:r>
+    </w:p>
+    <w:p>
+      <w:pPr>
+        <w:pStyle w:val="ListBullet"/>
+      </w:pPr>
+      <w:r>
+        <w:rPr>
+          <w:b w:val="0"/>
+        </w:rPr>
+        <w:t>DSCR shortfall indicates limited capacity to cover debt service.</w:t>
+      </w:r>
+    </w:p>
+    <w:p>
+      <w:pPr>
+        <w:pStyle w:val="ListBullet"/>
+      </w:pPr>
+      <w:r>
+        <w:rPr>
+          <w:b w:val="0"/>
+        </w:rPr>
+        <w:t>Elevated GST‑vs‑bank‑credits gap suggests potential compliance or cash‑flow concerns.</w:t>
+      </w:r>
+    </w:p>
+    <w:p>
+      <w:pPr>
+        <w:pStyle w:val="ListBullet"/>
+      </w:pPr>
+      <w:r>
+        <w:rPr>
+          <w:b w:val="0"/>
+        </w:rPr>
+        <w:t>All other ratio thresholds are satisfied.</w:t>
       </w:r>
     </w:p>
     <w:tbl>
@@ -275,72 +555,110 @@
         <w:tblStyle w:val="LightGrid-Accent1"/>
         <w:tblW w:type="auto" w:w="0"/>
         <w:tblLook w:firstColumn="1" w:firstRow="1" w:lastColumn="0" w:lastRow="0" w:noHBand="0" w:noVBand="1" w:val="04A0"/>
+        <w:tblBorders>
+          <w:top w:val="single" w:sz="4" w:color="C9D3DF"/>
+          <w:left w:val="single" w:sz="4" w:color="C9D3DF"/>
+          <w:bottom w:val="single" w:sz="4" w:color="C9D3DF"/>
+          <w:right w:val="single" w:sz="4" w:color="C9D3DF"/>
+          <w:insideH w:val="single" w:sz="4" w:color="C9D3DF"/>
+          <w:insideV w:val="single" w:sz="4" w:color="C9D3DF"/>
+        </w:tblBorders>
       </w:tblPr>
       <w:tblGrid>
-        <w:gridCol w:w="1440"/>
-        <w:gridCol w:w="1440"/>
-        <w:gridCol w:w="1440"/>
-        <w:gridCol w:w="1440"/>
-        <w:gridCol w:w="1440"/>
-        <w:gridCol w:w="1440"/>
+        <w:gridCol w:w="1624"/>
+        <w:gridCol w:w="1624"/>
+        <w:gridCol w:w="1624"/>
+        <w:gridCol w:w="1624"/>
+        <w:gridCol w:w="1624"/>
+        <w:gridCol w:w="1624"/>
       </w:tblGrid>
       <w:tr>
         <w:tc>
           <w:tcPr>
-            <w:tcW w:type="dxa" w:w="1440"/>
+            <w:tcW w:type="dxa" w:w="1624"/>
+            <w:shd w:val="clear" w:fill="1F3A5F"/>
           </w:tcPr>
           <w:p>
             <w:r>
+              <w:rPr>
+                <w:b/>
+                <w:color w:val="FFFFFF"/>
+              </w:rPr>
               <w:t>Year</w:t>
             </w:r>
           </w:p>
         </w:tc>
         <w:tc>
           <w:tcPr>
-            <w:tcW w:type="dxa" w:w="1440"/>
+            <w:tcW w:type="dxa" w:w="1624"/>
+            <w:shd w:val="clear" w:fill="1F3A5F"/>
           </w:tcPr>
           <w:p>
             <w:r>
+              <w:rPr>
+                <w:b/>
+                <w:color w:val="FFFFFF"/>
+              </w:rPr>
               <w:t>Status</w:t>
             </w:r>
           </w:p>
         </w:tc>
         <w:tc>
           <w:tcPr>
-            <w:tcW w:type="dxa" w:w="1440"/>
+            <w:tcW w:type="dxa" w:w="1624"/>
+            <w:shd w:val="clear" w:fill="1F3A5F"/>
           </w:tcPr>
           <w:p>
             <w:r>
+              <w:rPr>
+                <w:b/>
+                <w:color w:val="FFFFFF"/>
+              </w:rPr>
               <w:t>Revenue</w:t>
             </w:r>
           </w:p>
         </w:tc>
         <w:tc>
           <w:tcPr>
-            <w:tcW w:type="dxa" w:w="1440"/>
+            <w:tcW w:type="dxa" w:w="1624"/>
+            <w:shd w:val="clear" w:fill="1F3A5F"/>
           </w:tcPr>
           <w:p>
             <w:r>
+              <w:rPr>
+                <w:b/>
+                <w:color w:val="FFFFFF"/>
+              </w:rPr>
               <w:t>PAT</w:t>
             </w:r>
           </w:p>
         </w:tc>
         <w:tc>
           <w:tcPr>
-            <w:tcW w:type="dxa" w:w="1440"/>
+            <w:tcW w:type="dxa" w:w="1624"/>
+            <w:shd w:val="clear" w:fill="1F3A5F"/>
           </w:tcPr>
           <w:p>
             <w:r>
+              <w:rPr>
+                <w:b/>
+                <w:color w:val="FFFFFF"/>
+              </w:rPr>
               <w:t>Depreciation</w:t>
             </w:r>
           </w:p>
         </w:tc>
         <w:tc>
           <w:tcPr>
-            <w:tcW w:type="dxa" w:w="1440"/>
+            <w:tcW w:type="dxa" w:w="1624"/>
+            <w:shd w:val="clear" w:fill="1F3A5F"/>
           </w:tcPr>
           <w:p>
             <w:r>
+              <w:rPr>
+                <w:b/>
+                <w:color w:val="FFFFFF"/>
+              </w:rPr>
               <w:t>Interest</w:t>
             </w:r>
           </w:p>
@@ -349,17 +667,20 @@
       <w:tr>
         <w:tc>
           <w:tcPr>
-            <w:tcW w:type="dxa" w:w="1440"/>
+            <w:tcW w:type="dxa" w:w="1624"/>
           </w:tcPr>
           <w:p>
             <w:r>
+              <w:rPr>
+                <w:b/>
+              </w:rPr>
               <w:t>FY24</w:t>
             </w:r>
           </w:p>
         </w:tc>
         <w:tc>
           <w:tcPr>
-            <w:tcW w:type="dxa" w:w="1440"/>
+            <w:tcW w:type="dxa" w:w="1624"/>
           </w:tcPr>
           <w:p>
             <w:r>
@@ -369,17 +690,17 @@
         </w:tc>
         <w:tc>
           <w:tcPr>
-            <w:tcW w:type="dxa" w:w="1440"/>
+            <w:tcW w:type="dxa" w:w="1624"/>
           </w:tcPr>
           <w:p>
             <w:r>
-              <w:t>14.6</w:t>
+              <w:t>14.60</w:t>
             </w:r>
           </w:p>
         </w:tc>
         <w:tc>
           <w:tcPr>
-            <w:tcW w:type="dxa" w:w="1440"/>
+            <w:tcW w:type="dxa" w:w="1624"/>
           </w:tcPr>
           <w:p>
             <w:r>
@@ -389,7 +710,7 @@
         </w:tc>
         <w:tc>
           <w:tcPr>
-            <w:tcW w:type="dxa" w:w="1440"/>
+            <w:tcW w:type="dxa" w:w="1624"/>
           </w:tcPr>
           <w:p>
             <w:r>
@@ -399,7 +720,7 @@
         </w:tc>
         <w:tc>
           <w:tcPr>
-            <w:tcW w:type="dxa" w:w="1440"/>
+            <w:tcW w:type="dxa" w:w="1624"/>
           </w:tcPr>
           <w:p>
             <w:r>
@@ -411,17 +732,20 @@
       <w:tr>
         <w:tc>
           <w:tcPr>
-            <w:tcW w:type="dxa" w:w="1440"/>
+            <w:tcW w:type="dxa" w:w="1624"/>
           </w:tcPr>
           <w:p>
             <w:r>
+              <w:rPr>
+                <w:b/>
+              </w:rPr>
               <w:t>FY25</w:t>
             </w:r>
           </w:p>
         </w:tc>
         <w:tc>
           <w:tcPr>
-            <w:tcW w:type="dxa" w:w="1440"/>
+            <w:tcW w:type="dxa" w:w="1624"/>
           </w:tcPr>
           <w:p>
             <w:r>
@@ -431,37 +755,37 @@
         </w:tc>
         <w:tc>
           <w:tcPr>
-            <w:tcW w:type="dxa" w:w="1440"/>
+            <w:tcW w:type="dxa" w:w="1624"/>
           </w:tcPr>
           <w:p>
             <w:r>
-              <w:t>15.4</w:t>
+              <w:t>15.40</w:t>
             </w:r>
           </w:p>
         </w:tc>
         <w:tc>
           <w:tcPr>
-            <w:tcW w:type="dxa" w:w="1440"/>
+            <w:tcW w:type="dxa" w:w="1624"/>
           </w:tcPr>
           <w:p>
             <w:r>
-              <w:t>1.2</w:t>
+              <w:t>1.20</w:t>
             </w:r>
           </w:p>
         </w:tc>
         <w:tc>
           <w:tcPr>
-            <w:tcW w:type="dxa" w:w="1440"/>
+            <w:tcW w:type="dxa" w:w="1624"/>
           </w:tcPr>
           <w:p>
             <w:r>
-              <w:t>0.6</w:t>
+              <w:t>0.60</w:t>
             </w:r>
           </w:p>
         </w:tc>
         <w:tc>
           <w:tcPr>
-            <w:tcW w:type="dxa" w:w="1440"/>
+            <w:tcW w:type="dxa" w:w="1624"/>
           </w:tcPr>
           <w:p>
             <w:r>
@@ -477,28 +801,46 @@
         <w:tblStyle w:val="LightGrid-Accent1"/>
         <w:tblW w:type="auto" w:w="0"/>
         <w:tblLook w:firstColumn="1" w:firstRow="1" w:lastColumn="0" w:lastRow="0" w:noHBand="0" w:noVBand="1" w:val="04A0"/>
+        <w:tblBorders>
+          <w:top w:val="single" w:sz="4" w:color="C9D3DF"/>
+          <w:left w:val="single" w:sz="4" w:color="C9D3DF"/>
+          <w:bottom w:val="single" w:sz="4" w:color="C9D3DF"/>
+          <w:right w:val="single" w:sz="4" w:color="C9D3DF"/>
+          <w:insideH w:val="single" w:sz="4" w:color="C9D3DF"/>
+          <w:insideV w:val="single" w:sz="4" w:color="C9D3DF"/>
+        </w:tblBorders>
       </w:tblPr>
       <w:tblGrid>
-        <w:gridCol w:w="4320"/>
-        <w:gridCol w:w="4320"/>
+        <w:gridCol w:w="4873"/>
+        <w:gridCol w:w="4873"/>
       </w:tblGrid>
       <w:tr>
         <w:tc>
           <w:tcPr>
-            <w:tcW w:type="dxa" w:w="4320"/>
+            <w:tcW w:type="dxa" w:w="5102"/>
+            <w:shd w:val="clear" w:fill="1F3A5F"/>
           </w:tcPr>
           <w:p>
             <w:r>
+              <w:rPr>
+                <w:b/>
+                <w:color w:val="FFFFFF"/>
+              </w:rPr>
               <w:t>Ratio</w:t>
             </w:r>
           </w:p>
         </w:tc>
         <w:tc>
           <w:tcPr>
-            <w:tcW w:type="dxa" w:w="4320"/>
+            <w:tcW w:type="dxa" w:w="3969"/>
+            <w:shd w:val="clear" w:fill="1F3A5F"/>
           </w:tcPr>
           <w:p>
             <w:r>
+              <w:rPr>
+                <w:b/>
+                <w:color w:val="FFFFFF"/>
+              </w:rPr>
               <w:t>Value</w:t>
             </w:r>
           </w:p>
@@ -507,17 +849,20 @@
       <w:tr>
         <w:tc>
           <w:tcPr>
-            <w:tcW w:type="dxa" w:w="4320"/>
+            <w:tcW w:type="dxa" w:w="5102"/>
           </w:tcPr>
           <w:p>
             <w:r>
+              <w:rPr>
+                <w:b/>
+              </w:rPr>
               <w:t>DSCR</w:t>
             </w:r>
           </w:p>
         </w:tc>
         <w:tc>
           <w:tcPr>
-            <w:tcW w:type="dxa" w:w="4320"/>
+            <w:tcW w:type="dxa" w:w="3969"/>
           </w:tcPr>
           <w:p>
             <w:r>
@@ -529,17 +874,20 @@
       <w:tr>
         <w:tc>
           <w:tcPr>
-            <w:tcW w:type="dxa" w:w="4320"/>
+            <w:tcW w:type="dxa" w:w="5102"/>
           </w:tcPr>
           <w:p>
             <w:r>
+              <w:rPr>
+                <w:b/>
+              </w:rPr>
               <w:t>Loan-to-value</w:t>
             </w:r>
           </w:p>
         </w:tc>
         <w:tc>
           <w:tcPr>
-            <w:tcW w:type="dxa" w:w="4320"/>
+            <w:tcW w:type="dxa" w:w="3969"/>
           </w:tcPr>
           <w:p>
             <w:r>
@@ -551,21 +899,24 @@
       <w:tr>
         <w:tc>
           <w:tcPr>
-            <w:tcW w:type="dxa" w:w="4320"/>
+            <w:tcW w:type="dxa" w:w="5102"/>
           </w:tcPr>
           <w:p>
             <w:r>
+              <w:rPr>
+                <w:b/>
+              </w:rPr>
               <w:t>Debt / equity</w:t>
             </w:r>
           </w:p>
         </w:tc>
         <w:tc>
           <w:tcPr>
-            <w:tcW w:type="dxa" w:w="4320"/>
+            <w:tcW w:type="dxa" w:w="3969"/>
           </w:tcPr>
           <w:p>
             <w:r>
-              <w:t>1.9</w:t>
+              <w:t>1.90</w:t>
             </w:r>
           </w:p>
         </w:tc>
@@ -573,21 +924,24 @@
       <w:tr>
         <w:tc>
           <w:tcPr>
-            <w:tcW w:type="dxa" w:w="4320"/>
+            <w:tcW w:type="dxa" w:w="5102"/>
           </w:tcPr>
           <w:p>
             <w:r>
+              <w:rPr>
+                <w:b/>
+              </w:rPr>
               <w:t>Current ratio</w:t>
             </w:r>
           </w:p>
         </w:tc>
         <w:tc>
           <w:tcPr>
-            <w:tcW w:type="dxa" w:w="4320"/>
+            <w:tcW w:type="dxa" w:w="3969"/>
           </w:tcPr>
           <w:p>
             <w:r>
-              <w:t>1.3</w:t>
+              <w:t>1.30</w:t>
             </w:r>
           </w:p>
         </w:tc>
@@ -595,17 +949,20 @@
       <w:tr>
         <w:tc>
           <w:tcPr>
-            <w:tcW w:type="dxa" w:w="4320"/>
+            <w:tcW w:type="dxa" w:w="5102"/>
           </w:tcPr>
           <w:p>
             <w:r>
+              <w:rPr>
+                <w:b/>
+              </w:rPr>
               <w:t>GST turnover vs bank credits gap</w:t>
             </w:r>
           </w:p>
         </w:tc>
         <w:tc>
           <w:tcPr>
-            <w:tcW w:type="dxa" w:w="4320"/>
+            <w:tcW w:type="dxa" w:w="3969"/>
           </w:tcPr>
           <w:p>
             <w:r>
@@ -617,21 +974,49 @@
       <w:tr>
         <w:tc>
           <w:tcPr>
-            <w:tcW w:type="dxa" w:w="4320"/>
+            <w:tcW w:type="dxa" w:w="5102"/>
           </w:tcPr>
           <w:p>
             <w:r>
-              <w:t>Cash accrual / debt service (₹ Cr)</w:t>
+              <w:rPr>
+                <w:b/>
+              </w:rPr>
+              <w:t>Annual cash accrual (₹ Cr)</w:t>
             </w:r>
           </w:p>
         </w:tc>
         <w:tc>
           <w:tcPr>
-            <w:tcW w:type="dxa" w:w="4320"/>
+            <w:tcW w:type="dxa" w:w="3969"/>
           </w:tcPr>
           <w:p>
             <w:r>
-              <w:t>2.48 / 2.3</w:t>
+              <w:t>2.48</w:t>
+            </w:r>
+          </w:p>
+        </w:tc>
+      </w:tr>
+      <w:tr>
+        <w:tc>
+          <w:tcPr>
+            <w:tcW w:type="dxa" w:w="5102"/>
+          </w:tcPr>
+          <w:p>
+            <w:r>
+              <w:rPr>
+                <w:b/>
+              </w:rPr>
+              <w:t>Annual debt service incl. new loan (₹ Cr)</w:t>
+            </w:r>
+          </w:p>
+        </w:tc>
+        <w:tc>
+          <w:tcPr>
+            <w:tcW w:type="dxa" w:w="3969"/>
+          </w:tcPr>
+          <w:p>
+            <w:r>
+              <w:t>2.30</w:t>
             </w:r>
           </w:p>
         </w:tc>
@@ -641,7 +1026,9 @@
     <w:p>
       <w:r>
         <w:rPr>
+          <w:i/>
           <w:color w:val="666666"/>
+          <w:sz w:val="18"/>
         </w:rPr>
         <w:t>All amounts in ₹ crore. Ratios are computed in code, not by the language model.</w:t>
       </w:r>
@@ -655,8 +1042,116 @@
       </w:r>
     </w:p>
     <w:p>
+      <w:pPr>
+        <w:spacing w:after="120"/>
+      </w:pPr>
       <w:r>
-        <w:t>The borrower’s DSCR of 1.08 falls short of the bank’s minimum requirement of 1.25, indicating limited capacity to meet debt service obligations, which total ₹2.3 Cr annually including the proposed loan. The GST‑to‑bank‑credits gap stands at 18.1%, exceeding the policy ceiling of 10%, and suggests a mismatch between reported turnover (₹18.2 Cr over the last 12 months) and bank‑funded exposure (₹14.9 Cr). Current liquidity is modest, with a current ratio of 1.3 and an average bank balance of ₹0.42 Cr, while annual cash accrual is only ₹2.48 Cr. The borrower’s leverage is elevated, reflected by a debt‑to‑equity ratio of 1.9 and a loan‑to‑value of 58.1%. Additional concerns include two bounced cheques in the past year and the absence of audited FY25 financials, with only provisional figures available. These factors collectively heighten credit risk.</w:t>
+        <w:rPr>
+          <w:b w:val="0"/>
+        </w:rPr>
+        <w:t xml:space="preserve">The borrower’s </w:t>
+      </w:r>
+      <w:r>
+        <w:rPr>
+          <w:b/>
+        </w:rPr>
+        <w:t>DSCR of 1.08</w:t>
+      </w:r>
+      <w:r>
+        <w:rPr>
+          <w:b w:val="0"/>
+        </w:rPr>
+        <w:t xml:space="preserve"> falls short of the required ≥ 1.25, indicating limited capacity to meet debt service after accounting for the proposed loan.</w:t>
+      </w:r>
+    </w:p>
+    <w:p>
+      <w:pPr>
+        <w:spacing w:after="120"/>
+      </w:pPr>
+      <w:r>
+        <w:rPr>
+          <w:b w:val="0"/>
+        </w:rPr>
+        <w:t xml:space="preserve">The loan‑to‑value ratio of </w:t>
+      </w:r>
+      <w:r>
+        <w:rPr>
+          <w:b/>
+        </w:rPr>
+        <w:t>58.1%</w:t>
+      </w:r>
+      <w:r>
+        <w:rPr>
+          <w:b w:val="0"/>
+        </w:rPr>
+        <w:t xml:space="preserve"> and debt‑to‑equity of 1.9 are within policy limits, and the current ratio of 1.3 meets the ≥ 1.2 threshold, suggesting adequate short‑term liquidity.</w:t>
+      </w:r>
+    </w:p>
+    <w:p>
+      <w:pPr>
+        <w:spacing w:after="120"/>
+      </w:pPr>
+      <w:r>
+        <w:rPr>
+          <w:b w:val="0"/>
+        </w:rPr>
+        <w:t xml:space="preserve">However, the </w:t>
+      </w:r>
+      <w:r>
+        <w:rPr>
+          <w:b/>
+        </w:rPr>
+        <w:t>GST vs bank credits gap of 18.1%</w:t>
+      </w:r>
+      <w:r>
+        <w:rPr>
+          <w:b w:val="0"/>
+        </w:rPr>
+        <w:t xml:space="preserve"> exceeds the ≤ 10% ceiling, reflecting a mismatch between tax filings and bank credit utilization. GST turnover for the last 12 months is ₹18.2 Cr, with 11 of 12 filings submitted on time.</w:t>
+      </w:r>
+    </w:p>
+    <w:p>
+      <w:pPr>
+        <w:spacing w:after="120"/>
+      </w:pPr>
+      <w:r>
+        <w:rPr>
+          <w:b w:val="0"/>
+        </w:rPr>
+        <w:t>Banking history shows credits of ₹14.9 Cr over 12 months, an average balance of ₹0.42 Cr, and two bounced cheques in the period.</w:t>
+      </w:r>
+    </w:p>
+    <w:p>
+      <w:pPr>
+        <w:pStyle w:val="ListBullet"/>
+      </w:pPr>
+      <w:r>
+        <w:rPr>
+          <w:b w:val="0"/>
+        </w:rPr>
+        <w:t>FY25 audited financials unavailable; provisional figures used</w:t>
+      </w:r>
+    </w:p>
+    <w:p>
+      <w:pPr>
+        <w:pStyle w:val="ListBullet"/>
+      </w:pPr>
+      <w:r>
+        <w:rPr>
+          <w:b w:val="0"/>
+        </w:rPr>
+        <w:t>DSCR breach and GST gap breach are primary risk drivers</w:t>
+      </w:r>
+    </w:p>
+    <w:p>
+      <w:pPr>
+        <w:pStyle w:val="ListBullet"/>
+      </w:pPr>
+      <w:r>
+        <w:rPr>
+          <w:b w:val="0"/>
+        </w:rPr>
+        <w:t>Limited credit history and cheque defaults add operational risk.</w:t>
       </w:r>
     </w:p>
     <w:p>
@@ -668,8 +1163,130 @@
       </w:r>
     </w:p>
     <w:p>
+      <w:pPr>
+        <w:spacing w:after="120"/>
+      </w:pPr>
       <w:r>
-        <w:t>The credit proposal complies with the majority of the bank’s underwriting criteria. The loan‑to‑value ratio of 58.1% satisfies the ≤ 70% requirement, and the debt‑to‑equity ratio of 1.9 is within the ≤ 2.0 limit. The current ratio of 1.3 exceeds the minimum of 1.2, and the requested loan amount of ₹5.0 Cr is below the ≤ ₹10 Cr ceiling, both resulting in passes. However, the debt service coverage ratio (DSCR) of 1.08 falls short of the required ≥ 1.25, and the GST versus bank credits gap of 18.1% exceeds the ≤ 10% threshold, leading to failures on those two rules.</w:t>
+        <w:rPr>
+          <w:b w:val="0"/>
+        </w:rPr>
+        <w:t xml:space="preserve">The loan complies with the </w:t>
+      </w:r>
+      <w:r>
+        <w:rPr>
+          <w:b/>
+        </w:rPr>
+        <w:t>Loan‑to‑value (58.1%)</w:t>
+      </w:r>
+      <w:r>
+        <w:rPr>
+          <w:b w:val="0"/>
+        </w:rPr>
+        <w:t xml:space="preserve">, </w:t>
+      </w:r>
+      <w:r>
+        <w:rPr>
+          <w:b/>
+        </w:rPr>
+        <w:t>Debt/Equity (1.9)</w:t>
+      </w:r>
+      <w:r>
+        <w:rPr>
+          <w:b w:val="0"/>
+        </w:rPr>
+        <w:t xml:space="preserve">, </w:t>
+      </w:r>
+      <w:r>
+        <w:rPr>
+          <w:b/>
+        </w:rPr>
+        <w:t>Current ratio (1.3)</w:t>
+      </w:r>
+      <w:r>
+        <w:rPr>
+          <w:b w:val="0"/>
+        </w:rPr>
+        <w:t xml:space="preserve"> and </w:t>
+      </w:r>
+      <w:r>
+        <w:rPr>
+          <w:b/>
+        </w:rPr>
+        <w:t>Loan amount (₹5.0 Cr)</w:t>
+      </w:r>
+      <w:r>
+        <w:rPr>
+          <w:b w:val="0"/>
+        </w:rPr>
+        <w:t xml:space="preserve"> requirements, each meeting or exceeding the stipulated thresholds.</w:t>
+      </w:r>
+    </w:p>
+    <w:p>
+      <w:pPr>
+        <w:spacing w:after="120"/>
+      </w:pPr>
+      <w:r>
+        <w:rPr>
+          <w:b w:val="0"/>
+        </w:rPr>
+        <w:t xml:space="preserve">However, the </w:t>
+      </w:r>
+      <w:r>
+        <w:rPr>
+          <w:b/>
+        </w:rPr>
+        <w:t>DSCR (1.08)</w:t>
+      </w:r>
+      <w:r>
+        <w:rPr>
+          <w:b w:val="0"/>
+        </w:rPr>
+        <w:t xml:space="preserve"> falls short of the required ≥ 1.25, and the </w:t>
+      </w:r>
+      <w:r>
+        <w:rPr>
+          <w:b/>
+        </w:rPr>
+        <w:t>GST vs bank credits gap (18.1%)</w:t>
+      </w:r>
+      <w:r>
+        <w:rPr>
+          <w:b w:val="0"/>
+        </w:rPr>
+        <w:t xml:space="preserve"> exceeds the allowable ≤ 10%, resulting in failures for these two controls.</w:t>
+      </w:r>
+    </w:p>
+    <w:p>
+      <w:pPr>
+        <w:pStyle w:val="ListBullet"/>
+      </w:pPr>
+      <w:r>
+        <w:rPr>
+          <w:b w:val="0"/>
+        </w:rPr>
+        <w:t>DSCR below policy minimum may limit cash‑flow coverage.</w:t>
+      </w:r>
+    </w:p>
+    <w:p>
+      <w:pPr>
+        <w:pStyle w:val="ListBullet"/>
+      </w:pPr>
+      <w:r>
+        <w:rPr>
+          <w:b w:val="0"/>
+        </w:rPr>
+        <w:t>Elevated GST‑credit gap indicates potential compliance or reporting risk.</w:t>
+      </w:r>
+    </w:p>
+    <w:p>
+      <w:pPr>
+        <w:spacing w:after="120"/>
+      </w:pPr>
+      <w:r>
+        <w:rPr>
+          <w:b w:val="0"/>
+        </w:rPr>
+        <w:t>All other policy checks are satisfied.</w:t>
       </w:r>
     </w:p>
     <w:tbl>
@@ -677,50 +1294,78 @@
         <w:tblStyle w:val="LightGrid-Accent1"/>
         <w:tblW w:type="auto" w:w="0"/>
         <w:tblLook w:firstColumn="1" w:firstRow="1" w:lastColumn="0" w:lastRow="0" w:noHBand="0" w:noVBand="1" w:val="04A0"/>
+        <w:tblBorders>
+          <w:top w:val="single" w:sz="4" w:color="C9D3DF"/>
+          <w:left w:val="single" w:sz="4" w:color="C9D3DF"/>
+          <w:bottom w:val="single" w:sz="4" w:color="C9D3DF"/>
+          <w:right w:val="single" w:sz="4" w:color="C9D3DF"/>
+          <w:insideH w:val="single" w:sz="4" w:color="C9D3DF"/>
+          <w:insideV w:val="single" w:sz="4" w:color="C9D3DF"/>
+        </w:tblBorders>
       </w:tblPr>
       <w:tblGrid>
-        <w:gridCol w:w="2160"/>
-        <w:gridCol w:w="2160"/>
-        <w:gridCol w:w="2160"/>
-        <w:gridCol w:w="2160"/>
+        <w:gridCol w:w="2436"/>
+        <w:gridCol w:w="2436"/>
+        <w:gridCol w:w="2436"/>
+        <w:gridCol w:w="2436"/>
       </w:tblGrid>
       <w:tr>
         <w:tc>
           <w:tcPr>
-            <w:tcW w:type="dxa" w:w="2160"/>
+            <w:tcW w:type="dxa" w:w="2436"/>
+            <w:shd w:val="clear" w:fill="1F3A5F"/>
           </w:tcPr>
           <w:p>
             <w:r>
+              <w:rPr>
+                <w:b/>
+                <w:color w:val="FFFFFF"/>
+              </w:rPr>
               <w:t>Rule</w:t>
             </w:r>
           </w:p>
         </w:tc>
         <w:tc>
           <w:tcPr>
-            <w:tcW w:type="dxa" w:w="2160"/>
+            <w:tcW w:type="dxa" w:w="2436"/>
+            <w:shd w:val="clear" w:fill="1F3A5F"/>
           </w:tcPr>
           <w:p>
             <w:r>
+              <w:rPr>
+                <w:b/>
+                <w:color w:val="FFFFFF"/>
+              </w:rPr>
               <w:t>Required</w:t>
             </w:r>
           </w:p>
         </w:tc>
         <w:tc>
           <w:tcPr>
-            <w:tcW w:type="dxa" w:w="2160"/>
+            <w:tcW w:type="dxa" w:w="2436"/>
+            <w:shd w:val="clear" w:fill="1F3A5F"/>
           </w:tcPr>
           <w:p>
             <w:r>
+              <w:rPr>
+                <w:b/>
+                <w:color w:val="FFFFFF"/>
+              </w:rPr>
               <w:t>Actual</w:t>
             </w:r>
           </w:p>
         </w:tc>
         <w:tc>
           <w:tcPr>
-            <w:tcW w:type="dxa" w:w="2160"/>
+            <w:tcW w:type="dxa" w:w="2436"/>
+            <w:shd w:val="clear" w:fill="1F3A5F"/>
           </w:tcPr>
           <w:p>
             <w:r>
+              <w:rPr>
+                <w:b/>
+                <w:color w:val="FFFFFF"/>
+              </w:rPr>
               <w:t>Result</w:t>
             </w:r>
           </w:p>
@@ -729,17 +1374,20 @@
       <w:tr>
         <w:tc>
           <w:tcPr>
-            <w:tcW w:type="dxa" w:w="2160"/>
+            <w:tcW w:type="dxa" w:w="2436"/>
           </w:tcPr>
           <w:p>
             <w:r>
+              <w:rPr>
+                <w:b/>
+              </w:rPr>
               <w:t>DSCR</w:t>
             </w:r>
           </w:p>
         </w:tc>
         <w:tc>
           <w:tcPr>
-            <w:tcW w:type="dxa" w:w="2160"/>
+            <w:tcW w:type="dxa" w:w="2436"/>
           </w:tcPr>
           <w:p>
             <w:r>
@@ -749,7 +1397,7 @@
         </w:tc>
         <w:tc>
           <w:tcPr>
-            <w:tcW w:type="dxa" w:w="2160"/>
+            <w:tcW w:type="dxa" w:w="2436"/>
           </w:tcPr>
           <w:p>
             <w:r>
@@ -759,7 +1407,7 @@
         </w:tc>
         <w:tc>
           <w:tcPr>
-            <w:tcW w:type="dxa" w:w="2160"/>
+            <w:tcW w:type="dxa" w:w="2436"/>
           </w:tcPr>
           <w:p>
             <w:r>
@@ -775,17 +1423,20 @@
       <w:tr>
         <w:tc>
           <w:tcPr>
-            <w:tcW w:type="dxa" w:w="2160"/>
+            <w:tcW w:type="dxa" w:w="2436"/>
           </w:tcPr>
           <w:p>
             <w:r>
+              <w:rPr>
+                <w:b/>
+              </w:rPr>
               <w:t>Loan-to-value</w:t>
             </w:r>
           </w:p>
         </w:tc>
         <w:tc>
           <w:tcPr>
-            <w:tcW w:type="dxa" w:w="2160"/>
+            <w:tcW w:type="dxa" w:w="2436"/>
           </w:tcPr>
           <w:p>
             <w:r>
@@ -795,7 +1446,7 @@
         </w:tc>
         <w:tc>
           <w:tcPr>
-            <w:tcW w:type="dxa" w:w="2160"/>
+            <w:tcW w:type="dxa" w:w="2436"/>
           </w:tcPr>
           <w:p>
             <w:r>
@@ -805,7 +1456,7 @@
         </w:tc>
         <w:tc>
           <w:tcPr>
-            <w:tcW w:type="dxa" w:w="2160"/>
+            <w:tcW w:type="dxa" w:w="2436"/>
           </w:tcPr>
           <w:p>
             <w:r>
@@ -821,17 +1472,20 @@
       <w:tr>
         <w:tc>
           <w:tcPr>
-            <w:tcW w:type="dxa" w:w="2160"/>
+            <w:tcW w:type="dxa" w:w="2436"/>
           </w:tcPr>
           <w:p>
             <w:r>
+              <w:rPr>
+                <w:b/>
+              </w:rPr>
               <w:t>Debt/equity</w:t>
             </w:r>
           </w:p>
         </w:tc>
         <w:tc>
           <w:tcPr>
-            <w:tcW w:type="dxa" w:w="2160"/>
+            <w:tcW w:type="dxa" w:w="2436"/>
           </w:tcPr>
           <w:p>
             <w:r>
@@ -841,7 +1495,7 @@
         </w:tc>
         <w:tc>
           <w:tcPr>
-            <w:tcW w:type="dxa" w:w="2160"/>
+            <w:tcW w:type="dxa" w:w="2436"/>
           </w:tcPr>
           <w:p>
             <w:r>
@@ -851,7 +1505,7 @@
         </w:tc>
         <w:tc>
           <w:tcPr>
-            <w:tcW w:type="dxa" w:w="2160"/>
+            <w:tcW w:type="dxa" w:w="2436"/>
           </w:tcPr>
           <w:p>
             <w:r>
@@ -867,17 +1521,20 @@
       <w:tr>
         <w:tc>
           <w:tcPr>
-            <w:tcW w:type="dxa" w:w="2160"/>
+            <w:tcW w:type="dxa" w:w="2436"/>
           </w:tcPr>
           <w:p>
             <w:r>
+              <w:rPr>
+                <w:b/>
+              </w:rPr>
               <w:t>Current ratio</w:t>
             </w:r>
           </w:p>
         </w:tc>
         <w:tc>
           <w:tcPr>
-            <w:tcW w:type="dxa" w:w="2160"/>
+            <w:tcW w:type="dxa" w:w="2436"/>
           </w:tcPr>
           <w:p>
             <w:r>
@@ -887,7 +1544,7 @@
         </w:tc>
         <w:tc>
           <w:tcPr>
-            <w:tcW w:type="dxa" w:w="2160"/>
+            <w:tcW w:type="dxa" w:w="2436"/>
           </w:tcPr>
           <w:p>
             <w:r>
@@ -897,7 +1554,7 @@
         </w:tc>
         <w:tc>
           <w:tcPr>
-            <w:tcW w:type="dxa" w:w="2160"/>
+            <w:tcW w:type="dxa" w:w="2436"/>
           </w:tcPr>
           <w:p>
             <w:r>
@@ -913,17 +1570,20 @@
       <w:tr>
         <w:tc>
           <w:tcPr>
-            <w:tcW w:type="dxa" w:w="2160"/>
+            <w:tcW w:type="dxa" w:w="2436"/>
           </w:tcPr>
           <w:p>
             <w:r>
+              <w:rPr>
+                <w:b/>
+              </w:rPr>
               <w:t>GST vs bank credits gap</w:t>
             </w:r>
           </w:p>
         </w:tc>
         <w:tc>
           <w:tcPr>
-            <w:tcW w:type="dxa" w:w="2160"/>
+            <w:tcW w:type="dxa" w:w="2436"/>
           </w:tcPr>
           <w:p>
             <w:r>
@@ -933,7 +1593,7 @@
         </w:tc>
         <w:tc>
           <w:tcPr>
-            <w:tcW w:type="dxa" w:w="2160"/>
+            <w:tcW w:type="dxa" w:w="2436"/>
           </w:tcPr>
           <w:p>
             <w:r>
@@ -943,7 +1603,7 @@
         </w:tc>
         <w:tc>
           <w:tcPr>
-            <w:tcW w:type="dxa" w:w="2160"/>
+            <w:tcW w:type="dxa" w:w="2436"/>
           </w:tcPr>
           <w:p>
             <w:r>
@@ -959,17 +1619,20 @@
       <w:tr>
         <w:tc>
           <w:tcPr>
-            <w:tcW w:type="dxa" w:w="2160"/>
+            <w:tcW w:type="dxa" w:w="2436"/>
           </w:tcPr>
           <w:p>
             <w:r>
+              <w:rPr>
+                <w:b/>
+              </w:rPr>
               <w:t>Loan amount</w:t>
             </w:r>
           </w:p>
         </w:tc>
         <w:tc>
           <w:tcPr>
-            <w:tcW w:type="dxa" w:w="2160"/>
+            <w:tcW w:type="dxa" w:w="2436"/>
           </w:tcPr>
           <w:p>
             <w:r>
@@ -979,7 +1642,7 @@
         </w:tc>
         <w:tc>
           <w:tcPr>
-            <w:tcW w:type="dxa" w:w="2160"/>
+            <w:tcW w:type="dxa" w:w="2436"/>
           </w:tcPr>
           <w:p>
             <w:r>
@@ -989,7 +1652,7 @@
         </w:tc>
         <w:tc>
           <w:tcPr>
-            <w:tcW w:type="dxa" w:w="2160"/>
+            <w:tcW w:type="dxa" w:w="2436"/>
           </w:tcPr>
           <w:p>
             <w:r>
@@ -1013,8 +1676,105 @@
       </w:r>
     </w:p>
     <w:p>
+      <w:pPr>
+        <w:spacing w:after="120"/>
+      </w:pPr>
       <w:r>
-        <w:t>The recommendation is to REFER TO COMMITTEE WITH CONDITIONS. The borrower seeks a term loan of ₹5.0 Cr. The application fails two mandatory underwriting rules: the Debt Service Coverage Ratio is 1.08, below the required ≥ 1.25, and the GST‑vs‑bank‑credits gap is 18.1%, exceeding the allowable ≤ 10%. Additional risk flags include the absence of FY25 audited financials (only provisional figures are available) and two bounced cheques in the last 12 months. Conditions for committee approval should include: (1) submission of audited FY25 financial statements; (2) a detailed explanation and remediation plan for the 18.1% GST‑bank credit discrepancy; (3) a strategy to improve DSCR to at least 1.25; and (4) clarification of the reasons for the bounced cheques and corrective actions taken.</w:t>
+        <w:rPr>
+          <w:b/>
+        </w:rPr>
+        <w:t>REFER TO COMMITTEE WITH CONDITIONS</w:t>
+      </w:r>
+    </w:p>
+    <w:p>
+      <w:pPr>
+        <w:spacing w:after="120"/>
+      </w:pPr>
+      <w:r>
+        <w:rPr>
+          <w:b w:val="0"/>
+        </w:rPr>
+        <w:t xml:space="preserve">The applicant seeks a </w:t>
+      </w:r>
+      <w:r>
+        <w:rPr>
+          <w:b/>
+        </w:rPr>
+        <w:t>₹5.0 Cr term loan</w:t>
+      </w:r>
+      <w:r>
+        <w:rPr>
+          <w:b w:val="0"/>
+        </w:rPr>
+        <w:t xml:space="preserve">. Current analysis shows a </w:t>
+      </w:r>
+      <w:r>
+        <w:rPr>
+          <w:b/>
+        </w:rPr>
+        <w:t>DSCR of 1.08</w:t>
+      </w:r>
+      <w:r>
+        <w:rPr>
+          <w:b w:val="0"/>
+        </w:rPr>
+        <w:t xml:space="preserve"> (policy minimum 1.25) and a </w:t>
+      </w:r>
+      <w:r>
+        <w:rPr>
+          <w:b/>
+        </w:rPr>
+        <w:t>GST‑vs‑bank‑credits gap of 18.1%</w:t>
+      </w:r>
+      <w:r>
+        <w:rPr>
+          <w:b w:val="0"/>
+        </w:rPr>
+        <w:t xml:space="preserve"> (policy maximum 10%). Both metrics have failed the respective policy checks. Additionally, FY25 audited financials are unavailable and two cheques have bounced in the last 12 months, further heightening risk.</w:t>
+      </w:r>
+    </w:p>
+    <w:p>
+      <w:pPr>
+        <w:pStyle w:val="ListBullet"/>
+      </w:pPr>
+      <w:r>
+        <w:rPr>
+          <w:b w:val="0"/>
+        </w:rPr>
+        <w:t>Submit audited FY25 financial statements for verification.</w:t>
+      </w:r>
+    </w:p>
+    <w:p>
+      <w:pPr>
+        <w:pStyle w:val="ListBullet"/>
+      </w:pPr>
+      <w:r>
+        <w:rPr>
+          <w:b w:val="0"/>
+        </w:rPr>
+        <w:t>Provide a detailed explanation and remediation plan for the GST‑vs‑bank‑credits discrepancy.</w:t>
+      </w:r>
+    </w:p>
+    <w:p>
+      <w:pPr>
+        <w:pStyle w:val="ListBullet"/>
+      </w:pPr>
+      <w:r>
+        <w:rPr>
+          <w:b w:val="0"/>
+        </w:rPr>
+        <w:t>Address the bounced cheques and demonstrate steps to improve cash flow to meet DSCR requirements.</w:t>
+      </w:r>
+    </w:p>
+    <w:p>
+      <w:pPr>
+        <w:spacing w:after="120"/>
+      </w:pPr>
+      <w:r>
+        <w:rPr>
+          <w:b w:val="0"/>
+        </w:rPr>
+        <w:t>These conditions must be satisfied before any final approval can be considered.</w:t>
       </w:r>
     </w:p>
     <w:p>
@@ -1025,11 +1785,183 @@
         <w:t>Agent self-check</w:t>
       </w:r>
     </w:p>
-    <w:p>
-      <w:r>
-        <w:t>Sections 5/5 · ratios computed: yes · policy rules tested: 6 (4 pass, 2 fail) · figures checked against source data: all grounded · repairs made: 0</w:t>
-      </w:r>
-    </w:p>
+    <w:tbl>
+      <w:tblPr>
+        <w:tblStyle w:val="LightGrid-Accent1"/>
+        <w:tblW w:type="auto" w:w="0"/>
+        <w:tblLook w:firstColumn="1" w:firstRow="1" w:lastColumn="0" w:lastRow="0" w:noHBand="0" w:noVBand="1" w:val="04A0"/>
+        <w:tblBorders>
+          <w:top w:val="single" w:sz="4" w:color="C9D3DF"/>
+          <w:left w:val="single" w:sz="4" w:color="C9D3DF"/>
+          <w:bottom w:val="single" w:sz="4" w:color="C9D3DF"/>
+          <w:right w:val="single" w:sz="4" w:color="C9D3DF"/>
+          <w:insideH w:val="single" w:sz="4" w:color="C9D3DF"/>
+          <w:insideV w:val="single" w:sz="4" w:color="C9D3DF"/>
+        </w:tblBorders>
+      </w:tblPr>
+      <w:tblGrid>
+        <w:gridCol w:w="4873"/>
+        <w:gridCol w:w="4873"/>
+      </w:tblGrid>
+      <w:tr>
+        <w:tc>
+          <w:tcPr>
+            <w:tcW w:type="dxa" w:w="5102"/>
+            <w:shd w:val="clear" w:fill="1F3A5F"/>
+          </w:tcPr>
+          <w:p>
+            <w:r>
+              <w:rPr>
+                <w:b/>
+                <w:color w:val="FFFFFF"/>
+              </w:rPr>
+              <w:t>Check</w:t>
+            </w:r>
+          </w:p>
+        </w:tc>
+        <w:tc>
+          <w:tcPr>
+            <w:tcW w:type="dxa" w:w="3969"/>
+            <w:shd w:val="clear" w:fill="1F3A5F"/>
+          </w:tcPr>
+          <w:p>
+            <w:r>
+              <w:rPr>
+                <w:b/>
+                <w:color w:val="FFFFFF"/>
+              </w:rPr>
+              <w:t>Result</w:t>
+            </w:r>
+          </w:p>
+        </w:tc>
+      </w:tr>
+      <w:tr>
+        <w:tc>
+          <w:tcPr>
+            <w:tcW w:type="dxa" w:w="5102"/>
+          </w:tcPr>
+          <w:p>
+            <w:r>
+              <w:rPr>
+                <w:b/>
+              </w:rPr>
+              <w:t>Sections written</w:t>
+            </w:r>
+          </w:p>
+        </w:tc>
+        <w:tc>
+          <w:tcPr>
+            <w:tcW w:type="dxa" w:w="3969"/>
+          </w:tcPr>
+          <w:p>
+            <w:r>
+              <w:t>5/5</w:t>
+            </w:r>
+          </w:p>
+        </w:tc>
+      </w:tr>
+      <w:tr>
+        <w:tc>
+          <w:tcPr>
+            <w:tcW w:type="dxa" w:w="5102"/>
+          </w:tcPr>
+          <w:p>
+            <w:r>
+              <w:rPr>
+                <w:b/>
+              </w:rPr>
+              <w:t>Ratios computed</w:t>
+            </w:r>
+          </w:p>
+        </w:tc>
+        <w:tc>
+          <w:tcPr>
+            <w:tcW w:type="dxa" w:w="3969"/>
+          </w:tcPr>
+          <w:p>
+            <w:r>
+              <w:t>yes</w:t>
+            </w:r>
+          </w:p>
+        </w:tc>
+      </w:tr>
+      <w:tr>
+        <w:tc>
+          <w:tcPr>
+            <w:tcW w:type="dxa" w:w="5102"/>
+          </w:tcPr>
+          <w:p>
+            <w:r>
+              <w:rPr>
+                <w:b/>
+              </w:rPr>
+              <w:t>Policy rules tested</w:t>
+            </w:r>
+          </w:p>
+        </w:tc>
+        <w:tc>
+          <w:tcPr>
+            <w:tcW w:type="dxa" w:w="3969"/>
+          </w:tcPr>
+          <w:p>
+            <w:r>
+              <w:t>6 (4 pass, 2 fail)</w:t>
+            </w:r>
+          </w:p>
+        </w:tc>
+      </w:tr>
+      <w:tr>
+        <w:tc>
+          <w:tcPr>
+            <w:tcW w:type="dxa" w:w="5102"/>
+          </w:tcPr>
+          <w:p>
+            <w:r>
+              <w:rPr>
+                <w:b/>
+              </w:rPr>
+              <w:t>Figures checked against source data</w:t>
+            </w:r>
+          </w:p>
+        </w:tc>
+        <w:tc>
+          <w:tcPr>
+            <w:tcW w:type="dxa" w:w="3969"/>
+          </w:tcPr>
+          <w:p>
+            <w:r>
+              <w:t>all grounded</w:t>
+            </w:r>
+          </w:p>
+        </w:tc>
+      </w:tr>
+      <w:tr>
+        <w:tc>
+          <w:tcPr>
+            <w:tcW w:type="dxa" w:w="5102"/>
+          </w:tcPr>
+          <w:p>
+            <w:r>
+              <w:rPr>
+                <w:b/>
+              </w:rPr>
+              <w:t>Repairs made by the agent</w:t>
+            </w:r>
+          </w:p>
+        </w:tc>
+        <w:tc>
+          <w:tcPr>
+            <w:tcW w:type="dxa" w:w="3969"/>
+          </w:tcPr>
+          <w:p>
+            <w:r>
+              <w:t>0</w:t>
+            </w:r>
+          </w:p>
+        </w:tc>
+      </w:tr>
+    </w:tbl>
+    <w:p/>
     <w:p>
       <w:pPr>
         <w:pStyle w:val="Heading2"/>
@@ -1043,28 +1975,46 @@
         <w:tblStyle w:val="LightGrid-Accent1"/>
         <w:tblW w:type="auto" w:w="0"/>
         <w:tblLook w:firstColumn="1" w:firstRow="1" w:lastColumn="0" w:lastRow="0" w:noHBand="0" w:noVBand="1" w:val="04A0"/>
+        <w:tblBorders>
+          <w:top w:val="single" w:sz="4" w:color="C9D3DF"/>
+          <w:left w:val="single" w:sz="4" w:color="C9D3DF"/>
+          <w:bottom w:val="single" w:sz="4" w:color="C9D3DF"/>
+          <w:right w:val="single" w:sz="4" w:color="C9D3DF"/>
+          <w:insideH w:val="single" w:sz="4" w:color="C9D3DF"/>
+          <w:insideV w:val="single" w:sz="4" w:color="C9D3DF"/>
+        </w:tblBorders>
       </w:tblPr>
       <w:tblGrid>
-        <w:gridCol w:w="4320"/>
-        <w:gridCol w:w="4320"/>
+        <w:gridCol w:w="4873"/>
+        <w:gridCol w:w="4873"/>
       </w:tblGrid>
       <w:tr>
         <w:tc>
           <w:tcPr>
-            <w:tcW w:type="dxa" w:w="4320"/>
+            <w:tcW w:type="dxa" w:w="3969"/>
+            <w:shd w:val="clear" w:fill="1F3A5F"/>
           </w:tcPr>
           <w:p>
             <w:r>
+              <w:rPr>
+                <w:b/>
+                <w:color w:val="FFFFFF"/>
+              </w:rPr>
               <w:t>Field</w:t>
             </w:r>
           </w:p>
         </w:tc>
         <w:tc>
           <w:tcPr>
-            <w:tcW w:type="dxa" w:w="4320"/>
+            <w:tcW w:type="dxa" w:w="5102"/>
+            <w:shd w:val="clear" w:fill="1F3A5F"/>
           </w:tcPr>
           <w:p>
             <w:r>
+              <w:rPr>
+                <w:b/>
+                <w:color w:val="FFFFFF"/>
+              </w:rPr>
               <w:t>Entry</w:t>
             </w:r>
           </w:p>
@@ -1073,17 +2023,20 @@
       <w:tr>
         <w:tc>
           <w:tcPr>
-            <w:tcW w:type="dxa" w:w="4320"/>
+            <w:tcW w:type="dxa" w:w="3969"/>
           </w:tcPr>
           <w:p>
             <w:r>
+              <w:rPr>
+                <w:b/>
+              </w:rPr>
               <w:t>Name</w:t>
             </w:r>
           </w:p>
         </w:tc>
         <w:tc>
           <w:tcPr>
-            <w:tcW w:type="dxa" w:w="4320"/>
+            <w:tcW w:type="dxa" w:w="5102"/>
           </w:tcPr>
           <w:p>
             <w:r/>
@@ -1093,17 +2046,20 @@
       <w:tr>
         <w:tc>
           <w:tcPr>
-            <w:tcW w:type="dxa" w:w="4320"/>
+            <w:tcW w:type="dxa" w:w="3969"/>
           </w:tcPr>
           <w:p>
             <w:r>
+              <w:rPr>
+                <w:b/>
+              </w:rPr>
               <w:t>Decision (approve / reject / refer)</w:t>
             </w:r>
           </w:p>
         </w:tc>
         <w:tc>
           <w:tcPr>
-            <w:tcW w:type="dxa" w:w="4320"/>
+            <w:tcW w:type="dxa" w:w="5102"/>
           </w:tcPr>
           <w:p>
             <w:r/>
@@ -1113,17 +2069,20 @@
       <w:tr>
         <w:tc>
           <w:tcPr>
-            <w:tcW w:type="dxa" w:w="4320"/>
+            <w:tcW w:type="dxa" w:w="3969"/>
           </w:tcPr>
           <w:p>
             <w:r>
+              <w:rPr>
+                <w:b/>
+              </w:rPr>
               <w:t>Conditions</w:t>
             </w:r>
           </w:p>
         </w:tc>
         <w:tc>
           <w:tcPr>
-            <w:tcW w:type="dxa" w:w="4320"/>
+            <w:tcW w:type="dxa" w:w="5102"/>
           </w:tcPr>
           <w:p>
             <w:r/>
@@ -1133,17 +2092,20 @@
       <w:tr>
         <w:tc>
           <w:tcPr>
-            <w:tcW w:type="dxa" w:w="4320"/>
+            <w:tcW w:type="dxa" w:w="3969"/>
           </w:tcPr>
           <w:p>
             <w:r>
+              <w:rPr>
+                <w:b/>
+              </w:rPr>
               <w:t>Signature and date</w:t>
             </w:r>
           </w:p>
         </w:tc>
         <w:tc>
           <w:tcPr>
-            <w:tcW w:type="dxa" w:w="4320"/>
+            <w:tcW w:type="dxa" w:w="5102"/>
           </w:tcPr>
           <w:p>
             <w:r/>
@@ -1170,72 +2132,110 @@
         <w:tblStyle w:val="LightGrid-Accent1"/>
         <w:tblW w:type="auto" w:w="0"/>
         <w:tblLook w:firstColumn="1" w:firstRow="1" w:lastColumn="0" w:lastRow="0" w:noHBand="0" w:noVBand="1" w:val="04A0"/>
+        <w:tblBorders>
+          <w:top w:val="single" w:sz="4" w:color="C9D3DF"/>
+          <w:left w:val="single" w:sz="4" w:color="C9D3DF"/>
+          <w:bottom w:val="single" w:sz="4" w:color="C9D3DF"/>
+          <w:right w:val="single" w:sz="4" w:color="C9D3DF"/>
+          <w:insideH w:val="single" w:sz="4" w:color="C9D3DF"/>
+          <w:insideV w:val="single" w:sz="4" w:color="C9D3DF"/>
+        </w:tblBorders>
       </w:tblPr>
       <w:tblGrid>
-        <w:gridCol w:w="1440"/>
-        <w:gridCol w:w="1440"/>
-        <w:gridCol w:w="1440"/>
-        <w:gridCol w:w="1440"/>
-        <w:gridCol w:w="1440"/>
-        <w:gridCol w:w="1440"/>
+        <w:gridCol w:w="1624"/>
+        <w:gridCol w:w="1624"/>
+        <w:gridCol w:w="1624"/>
+        <w:gridCol w:w="1624"/>
+        <w:gridCol w:w="1624"/>
+        <w:gridCol w:w="1624"/>
       </w:tblGrid>
       <w:tr>
         <w:tc>
           <w:tcPr>
-            <w:tcW w:type="dxa" w:w="1440"/>
+            <w:tcW w:type="dxa" w:w="454"/>
+            <w:shd w:val="clear" w:fill="1F3A5F"/>
           </w:tcPr>
           <w:p>
             <w:r>
+              <w:rPr>
+                <w:b/>
+                <w:color w:val="FFFFFF"/>
+              </w:rPr>
               <w:t>#</w:t>
             </w:r>
           </w:p>
         </w:tc>
         <w:tc>
           <w:tcPr>
-            <w:tcW w:type="dxa" w:w="1440"/>
+            <w:tcW w:type="dxa" w:w="2041"/>
+            <w:shd w:val="clear" w:fill="1F3A5F"/>
           </w:tcPr>
           <w:p>
             <w:r>
+              <w:rPr>
+                <w:b/>
+                <w:color w:val="FFFFFF"/>
+              </w:rPr>
               <w:t>Step</w:t>
             </w:r>
           </w:p>
         </w:tc>
         <w:tc>
           <w:tcPr>
-            <w:tcW w:type="dxa" w:w="1440"/>
+            <w:tcW w:type="dxa" w:w="737"/>
+            <w:shd w:val="clear" w:fill="1F3A5F"/>
           </w:tcPr>
           <w:p>
             <w:r>
+              <w:rPr>
+                <w:b/>
+                <w:color w:val="FFFFFF"/>
+              </w:rPr>
               <w:t>By</w:t>
             </w:r>
           </w:p>
         </w:tc>
         <w:tc>
           <w:tcPr>
-            <w:tcW w:type="dxa" w:w="1440"/>
+            <w:tcW w:type="dxa" w:w="794"/>
+            <w:shd w:val="clear" w:fill="1F3A5F"/>
           </w:tcPr>
           <w:p>
             <w:r>
+              <w:rPr>
+                <w:b/>
+                <w:color w:val="FFFFFF"/>
+              </w:rPr>
               <w:t>Status</w:t>
             </w:r>
           </w:p>
         </w:tc>
         <w:tc>
           <w:tcPr>
-            <w:tcW w:type="dxa" w:w="1440"/>
+            <w:tcW w:type="dxa" w:w="4762"/>
+            <w:shd w:val="clear" w:fill="1F3A5F"/>
           </w:tcPr>
           <w:p>
             <w:r>
+              <w:rPr>
+                <w:b/>
+                <w:color w:val="FFFFFF"/>
+              </w:rPr>
               <w:t>Result</w:t>
             </w:r>
           </w:p>
         </w:tc>
         <w:tc>
           <w:tcPr>
-            <w:tcW w:type="dxa" w:w="1440"/>
+            <w:tcW w:type="dxa" w:w="680"/>
+            <w:shd w:val="clear" w:fill="1F3A5F"/>
           </w:tcPr>
           <w:p>
             <w:r>
+              <w:rPr>
+                <w:b/>
+                <w:color w:val="FFFFFF"/>
+              </w:rPr>
               <w:t>ms</w:t>
             </w:r>
           </w:p>
@@ -1244,7 +2244,7 @@
       <w:tr>
         <w:tc>
           <w:tcPr>
-            <w:tcW w:type="dxa" w:w="1440"/>
+            <w:tcW w:type="dxa" w:w="454"/>
           </w:tcPr>
           <w:p>
             <w:r/>
@@ -1252,7 +2252,7 @@
         </w:tc>
         <w:tc>
           <w:tcPr>
-            <w:tcW w:type="dxa" w:w="1440"/>
+            <w:tcW w:type="dxa" w:w="2041"/>
           </w:tcPr>
           <w:p>
             <w:r>
@@ -1262,7 +2262,7 @@
         </w:tc>
         <w:tc>
           <w:tcPr>
-            <w:tcW w:type="dxa" w:w="1440"/>
+            <w:tcW w:type="dxa" w:w="737"/>
           </w:tcPr>
           <w:p>
             <w:r>
@@ -1272,7 +2272,7 @@
         </w:tc>
         <w:tc>
           <w:tcPr>
-            <w:tcW w:type="dxa" w:w="1440"/>
+            <w:tcW w:type="dxa" w:w="794"/>
           </w:tcPr>
           <w:p>
             <w:r>
@@ -1282,7 +2282,29 @@
         </w:tc>
         <w:tc>
           <w:tcPr>
-            <w:tcW w:type="dxa" w:w="1440"/>
+            <w:tcW w:type="dxa" w:w="4762"/>
+          </w:tcPr>
+          <w:p>
+            <w:r>
+              <w:t>plan drafted</w:t>
+            </w:r>
+          </w:p>
+        </w:tc>
+        <w:tc>
+          <w:tcPr>
+            <w:tcW w:type="dxa" w:w="680"/>
+          </w:tcPr>
+          <w:p>
+            <w:r>
+              <w:t>7837</w:t>
+            </w:r>
+          </w:p>
+        </w:tc>
+      </w:tr>
+      <w:tr>
+        <w:tc>
+          <w:tcPr>
+            <w:tcW w:type="dxa" w:w="454"/>
           </w:tcPr>
           <w:p>
             <w:r/>
@@ -1290,27 +2312,7 @@
         </w:tc>
         <w:tc>
           <w:tcPr>
-            <w:tcW w:type="dxa" w:w="1440"/>
-          </w:tcPr>
-          <w:p>
-            <w:r>
-              <w:t>2290</w:t>
-            </w:r>
-          </w:p>
-        </w:tc>
-      </w:tr>
-      <w:tr>
-        <w:tc>
-          <w:tcPr>
-            <w:tcW w:type="dxa" w:w="1440"/>
-          </w:tcPr>
-          <w:p>
-            <w:r/>
-          </w:p>
-        </w:tc>
-        <w:tc>
-          <w:tcPr>
-            <w:tcW w:type="dxa" w:w="1440"/>
+            <w:tcW w:type="dxa" w:w="2041"/>
           </w:tcPr>
           <w:p>
             <w:r>
@@ -1320,7 +2322,7 @@
         </w:tc>
         <w:tc>
           <w:tcPr>
-            <w:tcW w:type="dxa" w:w="1440"/>
+            <w:tcW w:type="dxa" w:w="737"/>
           </w:tcPr>
           <w:p>
             <w:r>
@@ -1330,7 +2332,7 @@
         </w:tc>
         <w:tc>
           <w:tcPr>
-            <w:tcW w:type="dxa" w:w="1440"/>
+            <w:tcW w:type="dxa" w:w="794"/>
           </w:tcPr>
           <w:p>
             <w:r>
@@ -1340,7 +2342,7 @@
         </w:tc>
         <w:tc>
           <w:tcPr>
-            <w:tcW w:type="dxa" w:w="1440"/>
+            <w:tcW w:type="dxa" w:w="4762"/>
           </w:tcPr>
           <w:p>
             <w:r>
@@ -1350,7 +2352,7 @@
         </w:tc>
         <w:tc>
           <w:tcPr>
-            <w:tcW w:type="dxa" w:w="1440"/>
+            <w:tcW w:type="dxa" w:w="680"/>
           </w:tcPr>
           <w:p>
             <w:r>
@@ -1362,7 +2364,7 @@
       <w:tr>
         <w:tc>
           <w:tcPr>
-            <w:tcW w:type="dxa" w:w="1440"/>
+            <w:tcW w:type="dxa" w:w="454"/>
           </w:tcPr>
           <w:p>
             <w:r>
@@ -1372,7 +2374,7 @@
         </w:tc>
         <w:tc>
           <w:tcPr>
-            <w:tcW w:type="dxa" w:w="1440"/>
+            <w:tcW w:type="dxa" w:w="2041"/>
           </w:tcPr>
           <w:p>
             <w:r>
@@ -1382,7 +2384,7 @@
         </w:tc>
         <w:tc>
           <w:tcPr>
-            <w:tcW w:type="dxa" w:w="1440"/>
+            <w:tcW w:type="dxa" w:w="737"/>
           </w:tcPr>
           <w:p>
             <w:r>
@@ -1392,7 +2394,7 @@
         </w:tc>
         <w:tc>
           <w:tcPr>
-            <w:tcW w:type="dxa" w:w="1440"/>
+            <w:tcW w:type="dxa" w:w="794"/>
           </w:tcPr>
           <w:p>
             <w:r>
@@ -1402,7 +2404,7 @@
         </w:tc>
         <w:tc>
           <w:tcPr>
-            <w:tcW w:type="dxa" w:w="1440"/>
+            <w:tcW w:type="dxa" w:w="4762"/>
           </w:tcPr>
           <w:p>
             <w:r>
@@ -1412,7 +2414,7 @@
         </w:tc>
         <w:tc>
           <w:tcPr>
-            <w:tcW w:type="dxa" w:w="1440"/>
+            <w:tcW w:type="dxa" w:w="680"/>
           </w:tcPr>
           <w:p>
             <w:r>
@@ -1424,7 +2426,7 @@
       <w:tr>
         <w:tc>
           <w:tcPr>
-            <w:tcW w:type="dxa" w:w="1440"/>
+            <w:tcW w:type="dxa" w:w="454"/>
           </w:tcPr>
           <w:p>
             <w:r>
@@ -1434,7 +2436,7 @@
         </w:tc>
         <w:tc>
           <w:tcPr>
-            <w:tcW w:type="dxa" w:w="1440"/>
+            <w:tcW w:type="dxa" w:w="2041"/>
           </w:tcPr>
           <w:p>
             <w:r>
@@ -1444,7 +2446,7 @@
         </w:tc>
         <w:tc>
           <w:tcPr>
-            <w:tcW w:type="dxa" w:w="1440"/>
+            <w:tcW w:type="dxa" w:w="737"/>
           </w:tcPr>
           <w:p>
             <w:r>
@@ -1454,7 +2456,7 @@
         </w:tc>
         <w:tc>
           <w:tcPr>
-            <w:tcW w:type="dxa" w:w="1440"/>
+            <w:tcW w:type="dxa" w:w="794"/>
           </w:tcPr>
           <w:p>
             <w:r>
@@ -1464,17 +2466,17 @@
         </w:tc>
         <w:tc>
           <w:tcPr>
-            <w:tcW w:type="dxa" w:w="1440"/>
+            <w:tcW w:type="dxa" w:w="4762"/>
           </w:tcPr>
           <w:p>
             <w:r>
-              <w:t>FY25: provisional, revenue ₹15.4 Cr, PAT ₹1.2 Cr</w:t>
+              <w:t>FY24: audited, revenue ₹14.6 Cr, PAT ₹1.08 Cr</w:t>
             </w:r>
           </w:p>
         </w:tc>
         <w:tc>
           <w:tcPr>
-            <w:tcW w:type="dxa" w:w="1440"/>
+            <w:tcW w:type="dxa" w:w="680"/>
           </w:tcPr>
           <w:p>
             <w:r>
@@ -1486,7 +2488,7 @@
       <w:tr>
         <w:tc>
           <w:tcPr>
-            <w:tcW w:type="dxa" w:w="1440"/>
+            <w:tcW w:type="dxa" w:w="454"/>
           </w:tcPr>
           <w:p>
             <w:r>
@@ -1496,7 +2498,7 @@
         </w:tc>
         <w:tc>
           <w:tcPr>
-            <w:tcW w:type="dxa" w:w="1440"/>
+            <w:tcW w:type="dxa" w:w="2041"/>
           </w:tcPr>
           <w:p>
             <w:r>
@@ -1506,7 +2508,7 @@
         </w:tc>
         <w:tc>
           <w:tcPr>
-            <w:tcW w:type="dxa" w:w="1440"/>
+            <w:tcW w:type="dxa" w:w="737"/>
           </w:tcPr>
           <w:p>
             <w:r>
@@ -1516,7 +2518,7 @@
         </w:tc>
         <w:tc>
           <w:tcPr>
-            <w:tcW w:type="dxa" w:w="1440"/>
+            <w:tcW w:type="dxa" w:w="794"/>
           </w:tcPr>
           <w:p>
             <w:r>
@@ -1526,17 +2528,17 @@
         </w:tc>
         <w:tc>
           <w:tcPr>
-            <w:tcW w:type="dxa" w:w="1440"/>
+            <w:tcW w:type="dxa" w:w="4762"/>
           </w:tcPr>
           <w:p>
             <w:r>
-              <w:t>FY24: audited, revenue ₹14.6 Cr, PAT ₹1.08 Cr</w:t>
+              <w:t>FY25: provisional, revenue ₹15.4 Cr, PAT ₹1.2 Cr</w:t>
             </w:r>
           </w:p>
         </w:tc>
         <w:tc>
           <w:tcPr>
-            <w:tcW w:type="dxa" w:w="1440"/>
+            <w:tcW w:type="dxa" w:w="680"/>
           </w:tcPr>
           <w:p>
             <w:r>
@@ -1548,7 +2550,7 @@
       <w:tr>
         <w:tc>
           <w:tcPr>
-            <w:tcW w:type="dxa" w:w="1440"/>
+            <w:tcW w:type="dxa" w:w="454"/>
           </w:tcPr>
           <w:p>
             <w:r>
@@ -1558,7 +2560,7 @@
         </w:tc>
         <w:tc>
           <w:tcPr>
-            <w:tcW w:type="dxa" w:w="1440"/>
+            <w:tcW w:type="dxa" w:w="2041"/>
           </w:tcPr>
           <w:p>
             <w:r>
@@ -1568,7 +2570,7 @@
         </w:tc>
         <w:tc>
           <w:tcPr>
-            <w:tcW w:type="dxa" w:w="1440"/>
+            <w:tcW w:type="dxa" w:w="737"/>
           </w:tcPr>
           <w:p>
             <w:r>
@@ -1578,7 +2580,7 @@
         </w:tc>
         <w:tc>
           <w:tcPr>
-            <w:tcW w:type="dxa" w:w="1440"/>
+            <w:tcW w:type="dxa" w:w="794"/>
           </w:tcPr>
           <w:p>
             <w:r>
@@ -1588,7 +2590,7 @@
         </w:tc>
         <w:tc>
           <w:tcPr>
-            <w:tcW w:type="dxa" w:w="1440"/>
+            <w:tcW w:type="dxa" w:w="4762"/>
           </w:tcPr>
           <w:p>
             <w:r>
@@ -1598,7 +2600,7 @@
         </w:tc>
         <w:tc>
           <w:tcPr>
-            <w:tcW w:type="dxa" w:w="1440"/>
+            <w:tcW w:type="dxa" w:w="680"/>
           </w:tcPr>
           <w:p>
             <w:r>
@@ -1610,7 +2612,7 @@
       <w:tr>
         <w:tc>
           <w:tcPr>
-            <w:tcW w:type="dxa" w:w="1440"/>
+            <w:tcW w:type="dxa" w:w="454"/>
           </w:tcPr>
           <w:p>
             <w:r>
@@ -1620,7 +2622,7 @@
         </w:tc>
         <w:tc>
           <w:tcPr>
-            <w:tcW w:type="dxa" w:w="1440"/>
+            <w:tcW w:type="dxa" w:w="2041"/>
           </w:tcPr>
           <w:p>
             <w:r>
@@ -1630,7 +2632,7 @@
         </w:tc>
         <w:tc>
           <w:tcPr>
-            <w:tcW w:type="dxa" w:w="1440"/>
+            <w:tcW w:type="dxa" w:w="737"/>
           </w:tcPr>
           <w:p>
             <w:r>
@@ -1640,7 +2642,7 @@
         </w:tc>
         <w:tc>
           <w:tcPr>
-            <w:tcW w:type="dxa" w:w="1440"/>
+            <w:tcW w:type="dxa" w:w="794"/>
           </w:tcPr>
           <w:p>
             <w:r>
@@ -1650,7 +2652,7 @@
         </w:tc>
         <w:tc>
           <w:tcPr>
-            <w:tcW w:type="dxa" w:w="1440"/>
+            <w:tcW w:type="dxa" w:w="4762"/>
           </w:tcPr>
           <w:p>
             <w:r>
@@ -1660,7 +2662,7 @@
         </w:tc>
         <w:tc>
           <w:tcPr>
-            <w:tcW w:type="dxa" w:w="1440"/>
+            <w:tcW w:type="dxa" w:w="680"/>
           </w:tcPr>
           <w:p>
             <w:r>
@@ -1672,7 +2674,7 @@
       <w:tr>
         <w:tc>
           <w:tcPr>
-            <w:tcW w:type="dxa" w:w="1440"/>
+            <w:tcW w:type="dxa" w:w="454"/>
           </w:tcPr>
           <w:p>
             <w:r>
@@ -1682,7 +2684,7 @@
         </w:tc>
         <w:tc>
           <w:tcPr>
-            <w:tcW w:type="dxa" w:w="1440"/>
+            <w:tcW w:type="dxa" w:w="2041"/>
           </w:tcPr>
           <w:p>
             <w:r>
@@ -1692,7 +2694,7 @@
         </w:tc>
         <w:tc>
           <w:tcPr>
-            <w:tcW w:type="dxa" w:w="1440"/>
+            <w:tcW w:type="dxa" w:w="737"/>
           </w:tcPr>
           <w:p>
             <w:r>
@@ -1702,7 +2704,7 @@
         </w:tc>
         <w:tc>
           <w:tcPr>
-            <w:tcW w:type="dxa" w:w="1440"/>
+            <w:tcW w:type="dxa" w:w="794"/>
           </w:tcPr>
           <w:p>
             <w:r>
@@ -1712,7 +2714,7 @@
         </w:tc>
         <w:tc>
           <w:tcPr>
-            <w:tcW w:type="dxa" w:w="1440"/>
+            <w:tcW w:type="dxa" w:w="4762"/>
           </w:tcPr>
           <w:p>
             <w:r>
@@ -1722,7 +2724,7 @@
         </w:tc>
         <w:tc>
           <w:tcPr>
-            <w:tcW w:type="dxa" w:w="1440"/>
+            <w:tcW w:type="dxa" w:w="680"/>
           </w:tcPr>
           <w:p>
             <w:r>
@@ -1734,7 +2736,7 @@
       <w:tr>
         <w:tc>
           <w:tcPr>
-            <w:tcW w:type="dxa" w:w="1440"/>
+            <w:tcW w:type="dxa" w:w="454"/>
           </w:tcPr>
           <w:p>
             <w:r>
@@ -1744,7 +2746,7 @@
         </w:tc>
         <w:tc>
           <w:tcPr>
-            <w:tcW w:type="dxa" w:w="1440"/>
+            <w:tcW w:type="dxa" w:w="2041"/>
           </w:tcPr>
           <w:p>
             <w:r>
@@ -1754,7 +2756,7 @@
         </w:tc>
         <w:tc>
           <w:tcPr>
-            <w:tcW w:type="dxa" w:w="1440"/>
+            <w:tcW w:type="dxa" w:w="737"/>
           </w:tcPr>
           <w:p>
             <w:r>
@@ -1764,7 +2766,7 @@
         </w:tc>
         <w:tc>
           <w:tcPr>
-            <w:tcW w:type="dxa" w:w="1440"/>
+            <w:tcW w:type="dxa" w:w="794"/>
           </w:tcPr>
           <w:p>
             <w:r>
@@ -1774,7 +2776,7 @@
         </w:tc>
         <w:tc>
           <w:tcPr>
-            <w:tcW w:type="dxa" w:w="1440"/>
+            <w:tcW w:type="dxa" w:w="4762"/>
           </w:tcPr>
           <w:p>
             <w:r>
@@ -1784,7 +2786,7 @@
         </w:tc>
         <w:tc>
           <w:tcPr>
-            <w:tcW w:type="dxa" w:w="1440"/>
+            <w:tcW w:type="dxa" w:w="680"/>
           </w:tcPr>
           <w:p>
             <w:r>
@@ -1796,7 +2798,7 @@
       <w:tr>
         <w:tc>
           <w:tcPr>
-            <w:tcW w:type="dxa" w:w="1440"/>
+            <w:tcW w:type="dxa" w:w="454"/>
           </w:tcPr>
           <w:p>
             <w:r>
@@ -1806,7 +2808,7 @@
         </w:tc>
         <w:tc>
           <w:tcPr>
-            <w:tcW w:type="dxa" w:w="1440"/>
+            <w:tcW w:type="dxa" w:w="2041"/>
           </w:tcPr>
           <w:p>
             <w:r>
@@ -1816,7 +2818,7 @@
         </w:tc>
         <w:tc>
           <w:tcPr>
-            <w:tcW w:type="dxa" w:w="1440"/>
+            <w:tcW w:type="dxa" w:w="737"/>
           </w:tcPr>
           <w:p>
             <w:r>
@@ -1826,7 +2828,7 @@
         </w:tc>
         <w:tc>
           <w:tcPr>
-            <w:tcW w:type="dxa" w:w="1440"/>
+            <w:tcW w:type="dxa" w:w="794"/>
           </w:tcPr>
           <w:p>
             <w:r>
@@ -1836,21 +2838,21 @@
         </w:tc>
         <w:tc>
           <w:tcPr>
-            <w:tcW w:type="dxa" w:w="1440"/>
+            <w:tcW w:type="dxa" w:w="4762"/>
           </w:tcPr>
           <w:p>
             <w:r>
-              <w:t>67 words</w:t>
+              <w:t>52 words</w:t>
             </w:r>
           </w:p>
         </w:tc>
         <w:tc>
           <w:tcPr>
-            <w:tcW w:type="dxa" w:w="1440"/>
+            <w:tcW w:type="dxa" w:w="680"/>
           </w:tcPr>
           <w:p>
             <w:r>
-              <w:t>856</w:t>
+              <w:t>2772</w:t>
             </w:r>
           </w:p>
         </w:tc>
@@ -1858,7 +2860,7 @@
       <w:tr>
         <w:tc>
           <w:tcPr>
-            <w:tcW w:type="dxa" w:w="1440"/>
+            <w:tcW w:type="dxa" w:w="454"/>
           </w:tcPr>
           <w:p>
             <w:r>
@@ -1868,7 +2870,7 @@
         </w:tc>
         <w:tc>
           <w:tcPr>
-            <w:tcW w:type="dxa" w:w="1440"/>
+            <w:tcW w:type="dxa" w:w="2041"/>
           </w:tcPr>
           <w:p>
             <w:r>
@@ -1878,7 +2880,7 @@
         </w:tc>
         <w:tc>
           <w:tcPr>
-            <w:tcW w:type="dxa" w:w="1440"/>
+            <w:tcW w:type="dxa" w:w="737"/>
           </w:tcPr>
           <w:p>
             <w:r>
@@ -1888,7 +2890,7 @@
         </w:tc>
         <w:tc>
           <w:tcPr>
-            <w:tcW w:type="dxa" w:w="1440"/>
+            <w:tcW w:type="dxa" w:w="794"/>
           </w:tcPr>
           <w:p>
             <w:r>
@@ -1898,21 +2900,21 @@
         </w:tc>
         <w:tc>
           <w:tcPr>
-            <w:tcW w:type="dxa" w:w="1440"/>
+            <w:tcW w:type="dxa" w:w="4762"/>
           </w:tcPr>
           <w:p>
             <w:r>
-              <w:t>134 words</w:t>
+              <w:t>127 words</w:t>
             </w:r>
           </w:p>
         </w:tc>
         <w:tc>
           <w:tcPr>
-            <w:tcW w:type="dxa" w:w="1440"/>
+            <w:tcW w:type="dxa" w:w="680"/>
           </w:tcPr>
           <w:p>
             <w:r>
-              <w:t>1108</w:t>
+              <w:t>6211</w:t>
             </w:r>
           </w:p>
         </w:tc>
@@ -1920,7 +2922,7 @@
       <w:tr>
         <w:tc>
           <w:tcPr>
-            <w:tcW w:type="dxa" w:w="1440"/>
+            <w:tcW w:type="dxa" w:w="454"/>
           </w:tcPr>
           <w:p>
             <w:r>
@@ -1930,7 +2932,7 @@
         </w:tc>
         <w:tc>
           <w:tcPr>
-            <w:tcW w:type="dxa" w:w="1440"/>
+            <w:tcW w:type="dxa" w:w="2041"/>
           </w:tcPr>
           <w:p>
             <w:r>
@@ -1940,7 +2942,7 @@
         </w:tc>
         <w:tc>
           <w:tcPr>
-            <w:tcW w:type="dxa" w:w="1440"/>
+            <w:tcW w:type="dxa" w:w="737"/>
           </w:tcPr>
           <w:p>
             <w:r>
@@ -1950,7 +2952,7 @@
         </w:tc>
         <w:tc>
           <w:tcPr>
-            <w:tcW w:type="dxa" w:w="1440"/>
+            <w:tcW w:type="dxa" w:w="794"/>
           </w:tcPr>
           <w:p>
             <w:r>
@@ -1960,21 +2962,21 @@
         </w:tc>
         <w:tc>
           <w:tcPr>
-            <w:tcW w:type="dxa" w:w="1440"/>
+            <w:tcW w:type="dxa" w:w="4762"/>
           </w:tcPr>
           <w:p>
             <w:r>
-              <w:t>133 words</w:t>
+              <w:t>147 words</w:t>
             </w:r>
           </w:p>
         </w:tc>
         <w:tc>
           <w:tcPr>
-            <w:tcW w:type="dxa" w:w="1440"/>
+            <w:tcW w:type="dxa" w:w="680"/>
           </w:tcPr>
           <w:p>
             <w:r>
-              <w:t>1038</w:t>
+              <w:t>9066</w:t>
             </w:r>
           </w:p>
         </w:tc>
@@ -1982,7 +2984,7 @@
       <w:tr>
         <w:tc>
           <w:tcPr>
-            <w:tcW w:type="dxa" w:w="1440"/>
+            <w:tcW w:type="dxa" w:w="454"/>
           </w:tcPr>
           <w:p>
             <w:r>
@@ -1992,7 +2994,7 @@
         </w:tc>
         <w:tc>
           <w:tcPr>
-            <w:tcW w:type="dxa" w:w="1440"/>
+            <w:tcW w:type="dxa" w:w="2041"/>
           </w:tcPr>
           <w:p>
             <w:r>
@@ -2002,7 +3004,7 @@
         </w:tc>
         <w:tc>
           <w:tcPr>
-            <w:tcW w:type="dxa" w:w="1440"/>
+            <w:tcW w:type="dxa" w:w="737"/>
           </w:tcPr>
           <w:p>
             <w:r>
@@ -2012,7 +3014,7 @@
         </w:tc>
         <w:tc>
           <w:tcPr>
-            <w:tcW w:type="dxa" w:w="1440"/>
+            <w:tcW w:type="dxa" w:w="794"/>
           </w:tcPr>
           <w:p>
             <w:r>
@@ -2022,21 +3024,21 @@
         </w:tc>
         <w:tc>
           <w:tcPr>
-            <w:tcW w:type="dxa" w:w="1440"/>
+            <w:tcW w:type="dxa" w:w="4762"/>
           </w:tcPr>
           <w:p>
             <w:r>
-              <w:t>100 words</w:t>
+              <w:t>81 words</w:t>
             </w:r>
           </w:p>
         </w:tc>
         <w:tc>
           <w:tcPr>
-            <w:tcW w:type="dxa" w:w="1440"/>
+            <w:tcW w:type="dxa" w:w="680"/>
           </w:tcPr>
           <w:p>
             <w:r>
-              <w:t>875</w:t>
+              <w:t>5854</w:t>
             </w:r>
           </w:p>
         </w:tc>
@@ -2044,7 +3046,7 @@
       <w:tr>
         <w:tc>
           <w:tcPr>
-            <w:tcW w:type="dxa" w:w="1440"/>
+            <w:tcW w:type="dxa" w:w="454"/>
           </w:tcPr>
           <w:p>
             <w:r>
@@ -2054,7 +3056,7 @@
         </w:tc>
         <w:tc>
           <w:tcPr>
-            <w:tcW w:type="dxa" w:w="1440"/>
+            <w:tcW w:type="dxa" w:w="2041"/>
           </w:tcPr>
           <w:p>
             <w:r>
@@ -2064,7 +3066,7 @@
         </w:tc>
         <w:tc>
           <w:tcPr>
-            <w:tcW w:type="dxa" w:w="1440"/>
+            <w:tcW w:type="dxa" w:w="737"/>
           </w:tcPr>
           <w:p>
             <w:r>
@@ -2074,7 +3076,7 @@
         </w:tc>
         <w:tc>
           <w:tcPr>
-            <w:tcW w:type="dxa" w:w="1440"/>
+            <w:tcW w:type="dxa" w:w="794"/>
           </w:tcPr>
           <w:p>
             <w:r>
@@ -2084,21 +3086,21 @@
         </w:tc>
         <w:tc>
           <w:tcPr>
-            <w:tcW w:type="dxa" w:w="1440"/>
+            <w:tcW w:type="dxa" w:w="4762"/>
           </w:tcPr>
           <w:p>
             <w:r>
-              <w:t>122 words</w:t>
+              <w:t>107 words</w:t>
             </w:r>
           </w:p>
         </w:tc>
         <w:tc>
           <w:tcPr>
-            <w:tcW w:type="dxa" w:w="1440"/>
+            <w:tcW w:type="dxa" w:w="680"/>
           </w:tcPr>
           <w:p>
             <w:r>
-              <w:t>954</w:t>
+              <w:t>4891</w:t>
             </w:r>
           </w:p>
         </w:tc>
@@ -2106,24 +3108,61 @@
     </w:tbl>
     <w:p/>
     <w:p>
-      <w:pPr>
-        <w:jc w:val="left"/>
-      </w:pPr>
       <w:r>
         <w:rPr>
+          <w:i/>
           <w:color w:val="666666"/>
+          <w:sz w:val="18"/>
         </w:rPr>
         <w:t>* added by the agent's self-check.</w:t>
       </w:r>
     </w:p>
     <w:sectPr>
+      <w:headerReference w:type="default" r:id="rId9"/>
+      <w:footerReference w:type="default" r:id="rId10"/>
       <w:pgSz w:w="12240" w:h="15840"/>
-      <w:pgMar w:top="1440" w:right="1800" w:bottom="1440" w:left="1800" w:header="720" w:footer="720" w:gutter="0"/>
+      <w:pgMar w:top="1440" w:right="1247" w:bottom="1440" w:left="1247" w:header="720" w:footer="720" w:gutter="0"/>
       <w:cols w:space="720"/>
       <w:docGrid w:linePitch="360"/>
     </w:sectPr>
   </w:body>
 </w:document>
+</file>
+
+<file path=word/footer1.xml><?xml version="1.0" encoding="utf-8"?>
+<w:ftr xmlns:m="http://schemas.openxmlformats.org/officeDocument/2006/math" xmlns:mc="http://schemas.openxmlformats.org/markup-compatibility/2006" xmlns:mo="http://schemas.microsoft.com/office/mac/office/2008/main" xmlns:mv="urn:schemas-microsoft-com:mac:vml" xmlns:o="urn:schemas-microsoft-com:office:office" xmlns:r="http://schemas.openxmlformats.org/officeDocument/2006/relationships" xmlns:v="urn:schemas-microsoft-com:vml" xmlns:w10="urn:schemas-microsoft-com:office:word" xmlns:w14="http://schemas.microsoft.com/office/word/2010/wordml" xmlns:w="http://schemas.openxmlformats.org/wordprocessingml/2006/main" xmlns:wne="http://schemas.microsoft.com/office/word/2006/wordml" xmlns:wp14="http://schemas.microsoft.com/office/word/2010/wordprocessingDrawing" xmlns:wp="http://schemas.openxmlformats.org/drawingml/2006/wordprocessingDrawing" xmlns:wpc="http://schemas.microsoft.com/office/word/2010/wordprocessingCanvas" xmlns:wpg="http://schemas.microsoft.com/office/word/2010/wordprocessingGroup" xmlns:wpi="http://schemas.microsoft.com/office/word/2010/wordprocessingInk" xmlns:wps="http://schemas.microsoft.com/office/word/2010/wordprocessingShape" mc:Ignorable="w14 wp14">
+  <w:p>
+    <w:pPr>
+      <w:pStyle w:val="Footer"/>
+      <w:jc w:val="right"/>
+    </w:pPr>
+    <w:r>
+      <w:t xml:space="preserve">Page </w:t>
+    </w:r>
+    <w:fldSimple w:instr="PAGE">
+      <w:r>
+        <w:t>1</w:t>
+      </w:r>
+    </w:fldSimple>
+  </w:p>
+</w:ftr>
+</file>
+
+<file path=word/header1.xml><?xml version="1.0" encoding="utf-8"?>
+<w:hdr xmlns:m="http://schemas.openxmlformats.org/officeDocument/2006/math" xmlns:mc="http://schemas.openxmlformats.org/markup-compatibility/2006" xmlns:mo="http://schemas.microsoft.com/office/mac/office/2008/main" xmlns:mv="urn:schemas-microsoft-com:mac:vml" xmlns:o="urn:schemas-microsoft-com:office:office" xmlns:r="http://schemas.openxmlformats.org/officeDocument/2006/relationships" xmlns:v="urn:schemas-microsoft-com:vml" xmlns:w10="urn:schemas-microsoft-com:office:word" xmlns:w14="http://schemas.microsoft.com/office/word/2010/wordml" xmlns:w="http://schemas.openxmlformats.org/wordprocessingml/2006/main" xmlns:wne="http://schemas.microsoft.com/office/word/2006/wordml" xmlns:wp14="http://schemas.microsoft.com/office/word/2010/wordprocessingDrawing" xmlns:wp="http://schemas.openxmlformats.org/drawingml/2006/wordprocessingDrawing" xmlns:wpc="http://schemas.microsoft.com/office/word/2010/wordprocessingCanvas" xmlns:wpg="http://schemas.microsoft.com/office/word/2010/wordprocessingGroup" xmlns:wpi="http://schemas.microsoft.com/office/word/2010/wordprocessingInk" xmlns:wps="http://schemas.microsoft.com/office/word/2010/wordprocessingShape" mc:Ignorable="w14 wp14">
+  <w:p>
+    <w:pPr>
+      <w:pStyle w:val="Header"/>
+    </w:pPr>
+    <w:r>
+      <w:rPr>
+        <w:color w:val="666666"/>
+        <w:sz w:val="16"/>
+      </w:rPr>
+      <w:t>Credit Memo · Patel Agro Pvt Ltd · DRAFT for review</w:t>
+    </w:r>
+  </w:p>
+</w:hdr>
 </file>
 
 <file path=word/numbering.xml><?xml version="1.0" encoding="utf-8"?>
@@ -2556,7 +3595,7 @@
       <w:rFonts w:asciiTheme="majorHAnsi" w:eastAsiaTheme="majorEastAsia" w:hAnsiTheme="majorHAnsi" w:cstheme="majorBidi"/>
       <w:b/>
       <w:bCs/>
-      <w:color w:val="365F91" w:themeColor="accent1" w:themeShade="BF"/>
+      <w:color w:val="1F3A5F"/>
       <w:sz w:val="28"/>
       <w:szCs w:val="28"/>
     </w:rPr>
@@ -2580,7 +3619,7 @@
       <w:rFonts w:asciiTheme="majorHAnsi" w:eastAsiaTheme="majorEastAsia" w:hAnsiTheme="majorHAnsi" w:cstheme="majorBidi"/>
       <w:b/>
       <w:bCs/>
-      <w:color w:val="4F81BD" w:themeColor="accent1"/>
+      <w:color w:val="1F3A5F"/>
       <w:sz w:val="26"/>
       <w:szCs w:val="26"/>
     </w:rPr>

</xml_diff>